<commit_message>
corrige substituição do rodapé e atualiza Modelo_AR2.docx
- all_paragraphs agora percorre também os footers das seções, além dos
  cabeçalhos; rodapé do DOCX estava sendo ignorado na busca pelo placeholder
- gera_prova_bytes usa all_paragraphs para substituir {{Rodape aqui}}
- Modelo_AR2.docx atualizado com nova formatação

Co-Authored-By: Claude Sonnet 4.6 <noreply@anthropic.com>
</commit_message>
<xml_diff>
--- a/Modelo_AR2.docx
+++ b/Modelo_AR2.docx
@@ -369,46 +369,7 @@
           <w:lang w:val="pt-PT" w:eastAsia="pt-BR"/>
           <w14:ligatures w14:val="none"/>
         </w:rPr>
-        <w:t xml:space="preserve"> </w:t>
-      </w:r>
-      <w:r>
-        <w:rPr>
-          <w:rFonts w:eastAsia="Times New Roman" w:cs="Times New Roman" w:ascii="Arial Narrow" w:hAnsi="Arial Narrow"/>
-          <w:color w:val="000000"/>
-          <w:spacing w:val="-2"/>
-          <w:kern w:val="0"/>
-          <w:sz w:val="20"/>
-          <w:szCs w:val="20"/>
-          <w:lang w:val="pt-PT" w:eastAsia="pt-BR"/>
-          <w14:ligatures w14:val="none"/>
-        </w:rPr>
-        <w:t>{{Ano aqui}}</w:t>
-      </w:r>
-      <w:r>
-        <w:rPr>
-          <w:rFonts w:eastAsia="Times New Roman" w:cs="Times New Roman" w:ascii="Arial Narrow" w:hAnsi="Arial Narrow"/>
-          <w:color w:val="000000"/>
-          <w:spacing w:val="-2"/>
-          <w:kern w:val="0"/>
-          <w:sz w:val="20"/>
-          <w:szCs w:val="20"/>
-          <w:lang w:val="pt-PT" w:eastAsia="pt-BR"/>
-          <w14:ligatures w14:val="none"/>
-        </w:rPr>
-        <w:t>/</w:t>
-      </w:r>
-      <w:r>
-        <w:rPr>
-          <w:rFonts w:eastAsia="Times New Roman" w:cs="Times New Roman" w:ascii="Arial Narrow" w:hAnsi="Arial Narrow"/>
-          <w:color w:val="000000"/>
-          <w:spacing w:val="-2"/>
-          <w:kern w:val="0"/>
-          <w:sz w:val="20"/>
-          <w:szCs w:val="20"/>
-          <w:lang w:val="pt-PT" w:eastAsia="pt-BR"/>
-          <w14:ligatures w14:val="none"/>
-        </w:rPr>
-        <w:t>{{Sem aqui}}</w:t>
+        <w:t xml:space="preserve"> {{Ano aqui}}/{{Sem aqui}}</w:t>
       </w:r>
     </w:p>
     <w:p>
@@ -477,6 +438,7 @@
                 <w:tab w:val="left" w:pos="5924" w:leader="none"/>
                 <w:tab w:val="left" w:pos="10641" w:leader="none"/>
               </w:tabs>
+              <w:suppressAutoHyphens w:val="true"/>
               <w:spacing w:lineRule="exact" w:line="228" w:before="0" w:after="0"/>
               <w:jc w:val="left"/>
               <w:rPr>
@@ -494,7 +456,7 @@
                 <w:szCs w:val="28"/>
                 <w:lang w:eastAsia="en-US" w:bidi="ar-SA"/>
               </w:rPr>
-              <w:t xml:space="preserve">NOME:___________________________________________________________ RGM:___________________________ </w:t>
+              <w:t>NOME:___________________________________________________________ RGM:___________________________</w:t>
             </w:r>
           </w:p>
         </w:tc>
@@ -515,6 +477,7 @@
                 <w:tab w:val="clear" w:pos="708"/>
                 <w:tab w:val="left" w:pos="5113" w:leader="none"/>
               </w:tabs>
+              <w:suppressAutoHyphens w:val="true"/>
               <w:spacing w:lineRule="exact" w:line="210" w:before="108" w:after="0"/>
               <w:jc w:val="left"/>
               <w:rPr>
@@ -548,6 +511,7 @@
                 <w:tab w:val="clear" w:pos="708"/>
                 <w:tab w:val="left" w:pos="5390" w:leader="none"/>
               </w:tabs>
+              <w:suppressAutoHyphens w:val="true"/>
               <w:spacing w:lineRule="exact" w:line="210" w:before="108" w:after="0"/>
               <w:jc w:val="left"/>
               <w:rPr>
@@ -1050,10 +1014,13 @@
       </w:pPr>
       <w:r>
         <w:rPr>
-          <w:rFonts w:cs="Arial" w:ascii="Arial Narrow" w:hAnsi="Arial Narrow"/>
+          <w:rFonts w:eastAsia="Times New Roman" w:cs="Arial" w:ascii="Arial" w:hAnsi="Arial"/>
           <w:b/>
           <w:bCs/>
-          <w:color w:themeColor="text1" w:val="000000"/>
+          <w:color w:val="000000"/>
+          <w:kern w:val="0"/>
+          <w:lang w:eastAsia="pt-BR"/>
+          <w14:ligatures w14:val="none"/>
         </w:rPr>
       </w:r>
     </w:p>
@@ -1133,7 +1100,15 @@
         </w:rPr>
       </w:pPr>
       <w:r>
-        <w:rPr/>
+        <w:rPr>
+          <w:rFonts w:eastAsia="Times New Roman" w:cs="Arial" w:ascii="Arial Narrow" w:hAnsi="Arial Narrow"/>
+          <w:b/>
+          <w:bCs/>
+          <w:color w:val="000000"/>
+          <w:kern w:val="0"/>
+          <w:lang w:eastAsia="pt-BR"/>
+          <w14:ligatures w14:val="none"/>
+        </w:rPr>
         <w:drawing>
           <wp:anchor behindDoc="0" distT="0" distB="0" distL="0" distR="0" simplePos="0" locked="0" layoutInCell="0" allowOverlap="1" relativeHeight="3">
             <wp:simplePos x="0" y="0"/>
@@ -1185,7 +1160,94 @@
       <w:pPr>
         <w:pStyle w:val="Normal"/>
         <w:spacing w:lineRule="auto" w:line="240" w:before="0" w:after="0"/>
-        <w:jc w:val="both"/>
+        <w:jc w:val="left"/>
+        <w:rPr/>
+      </w:pPr>
+      <w:r>
+        <w:rPr>
+          <w:rFonts w:eastAsia="Times New Roman" w:cs="Arial" w:ascii="Arial Narrow" w:hAnsi="Arial Narrow"/>
+          <w:b/>
+          <w:bCs/>
+          <w:color w:val="000000"/>
+          <w:kern w:val="0"/>
+          <w:lang w:eastAsia="pt-BR"/>
+          <w14:ligatures w14:val="none"/>
+        </w:rPr>
+        <w:t xml:space="preserve">1. </w:t>
+      </w:r>
+      <w:r>
+        <w:rPr>
+          <w:rFonts w:eastAsia="Times New Roman" w:cs="Arial" w:ascii="Arial Narrow" w:hAnsi="Arial Narrow"/>
+          <w:b w:val="false"/>
+          <w:bCs w:val="false"/>
+          <w:color w:val="000000"/>
+          <w:kern w:val="0"/>
+          <w:lang w:eastAsia="pt-BR"/>
+          <w14:ligatures w14:val="none"/>
+        </w:rPr>
+        <w:t>{{Questão 1 aqui}}</w:t>
+      </w:r>
+    </w:p>
+    <w:p>
+      <w:pPr>
+        <w:pStyle w:val="Normal"/>
+        <w:spacing w:lineRule="auto" w:line="240" w:before="0" w:after="0"/>
+        <w:jc w:val="left"/>
+        <w:rPr>
+          <w:rFonts w:ascii="Arial Narrow" w:hAnsi="Arial Narrow" w:eastAsia="Times New Roman" w:cs="Arial"/>
+          <w:color w:val="000000"/>
+          <w:kern w:val="0"/>
+          <w:lang w:eastAsia="pt-BR"/>
+          <w14:ligatures w14:val="none"/>
+        </w:rPr>
+      </w:pPr>
+      <w:r>
+        <w:rPr>
+          <w:rFonts w:eastAsia="Times New Roman" w:cs="Arial" w:ascii="Arial Narrow" w:hAnsi="Arial Narrow"/>
+          <w:color w:val="000000"/>
+          <w:kern w:val="0"/>
+          <w:lang w:eastAsia="pt-BR"/>
+          <w14:ligatures w14:val="none"/>
+        </w:rPr>
+      </w:r>
+    </w:p>
+    <w:p>
+      <w:pPr>
+        <w:pStyle w:val="Normal"/>
+        <w:spacing w:lineRule="auto" w:line="240" w:before="0" w:after="0"/>
+        <w:jc w:val="left"/>
+        <w:rPr/>
+      </w:pPr>
+      <w:r>
+        <w:rPr>
+          <w:rFonts w:eastAsia="Times New Roman" w:cs="Arial" w:ascii="Arial Narrow" w:hAnsi="Arial Narrow"/>
+          <w:b/>
+          <w:bCs/>
+          <w:color w:val="000000"/>
+          <w:kern w:val="0"/>
+          <w:lang w:eastAsia="pt-BR"/>
+          <w14:ligatures w14:val="none"/>
+        </w:rPr>
+        <w:t xml:space="preserve">2.  </w:t>
+      </w:r>
+      <w:r>
+        <w:rPr>
+          <w:rFonts w:eastAsia="Times New Roman" w:cs="Arial" w:ascii="Arial Narrow" w:hAnsi="Arial Narrow"/>
+          <w:b w:val="false"/>
+          <w:bCs w:val="false"/>
+          <w:color w:val="000000"/>
+          <w:kern w:val="0"/>
+          <w:lang w:eastAsia="pt-BR"/>
+          <w14:ligatures w14:val="none"/>
+        </w:rPr>
+        <w:t>{{Questão 2 aqui}}</w:t>
+      </w:r>
+    </w:p>
+    <w:p>
+      <w:pPr>
+        <w:pStyle w:val="Normal"/>
+        <w:spacing w:lineRule="auto" w:line="240" w:before="0" w:after="0"/>
+        <w:jc w:val="left"/>
         <w:rPr>
           <w:rFonts w:ascii="Arial Narrow" w:hAnsi="Arial Narrow" w:eastAsia="Times New Roman" w:cs="Arial"/>
           <w:b/>
@@ -1206,7 +1268,26 @@
           <w:lang w:eastAsia="pt-BR"/>
           <w14:ligatures w14:val="none"/>
         </w:rPr>
-        <w:t xml:space="preserve">1. </w:t>
+      </w:r>
+    </w:p>
+    <w:p>
+      <w:pPr>
+        <w:pStyle w:val="Normal"/>
+        <w:spacing w:lineRule="auto" w:line="240" w:before="0" w:after="0"/>
+        <w:jc w:val="left"/>
+        <w:rPr/>
+      </w:pPr>
+      <w:r>
+        <w:rPr>
+          <w:rFonts w:eastAsia="Times New Roman" w:cs="Arial" w:ascii="Arial Narrow" w:hAnsi="Arial Narrow"/>
+          <w:b/>
+          <w:bCs/>
+          <w:color w:val="000000"/>
+          <w:kern w:val="0"/>
+          <w:lang w:eastAsia="pt-BR"/>
+          <w14:ligatures w14:val="none"/>
+        </w:rPr>
+        <w:t xml:space="preserve">3. </w:t>
       </w:r>
       <w:r>
         <w:rPr>
@@ -1218,14 +1299,14 @@
           <w:lang w:eastAsia="pt-BR"/>
           <w14:ligatures w14:val="none"/>
         </w:rPr>
-        <w:t>{{Questão 1 aqui}}</w:t>
-      </w:r>
-    </w:p>
-    <w:p>
-      <w:pPr>
-        <w:pStyle w:val="Normal"/>
-        <w:spacing w:lineRule="auto" w:line="240" w:before="0" w:after="0"/>
-        <w:jc w:val="both"/>
+        <w:t>{{Questão 3 aqui}}</w:t>
+      </w:r>
+    </w:p>
+    <w:p>
+      <w:pPr>
+        <w:pStyle w:val="Normal"/>
+        <w:spacing w:lineRule="auto" w:line="240" w:before="0" w:after="0"/>
+        <w:jc w:val="left"/>
         <w:rPr>
           <w:rFonts w:ascii="Arial Narrow" w:hAnsi="Arial Narrow" w:eastAsia="Times New Roman" w:cs="Arial"/>
           <w:color w:val="000000"/>
@@ -1248,9 +1329,12 @@
       <w:pPr>
         <w:pStyle w:val="Normal"/>
         <w:spacing w:lineRule="auto" w:line="240" w:before="0" w:after="0"/>
-        <w:jc w:val="both"/>
-        <w:rPr>
-          <w:rFonts w:ascii="Arial Narrow" w:hAnsi="Arial Narrow" w:eastAsia="Times New Roman" w:cs="Arial"/>
+        <w:jc w:val="left"/>
+        <w:rPr/>
+      </w:pPr>
+      <w:r>
+        <w:rPr>
+          <w:rFonts w:eastAsia="Times New Roman" w:cs="Arial" w:ascii="Arial Narrow" w:hAnsi="Arial Narrow"/>
           <w:b/>
           <w:bCs/>
           <w:color w:val="000000"/>
@@ -1258,6 +1342,50 @@
           <w:lang w:eastAsia="pt-BR"/>
           <w14:ligatures w14:val="none"/>
         </w:rPr>
+        <w:t xml:space="preserve">4. </w:t>
+      </w:r>
+      <w:r>
+        <w:rPr>
+          <w:rFonts w:eastAsia="Times New Roman" w:cs="Arial" w:ascii="Arial Narrow" w:hAnsi="Arial Narrow"/>
+          <w:b w:val="false"/>
+          <w:bCs w:val="false"/>
+          <w:color w:val="000000"/>
+          <w:kern w:val="0"/>
+          <w:lang w:eastAsia="pt-BR"/>
+          <w14:ligatures w14:val="none"/>
+        </w:rPr>
+        <w:t>{{Questão 4 aqui}}</w:t>
+      </w:r>
+    </w:p>
+    <w:p>
+      <w:pPr>
+        <w:pStyle w:val="Normal"/>
+        <w:spacing w:lineRule="auto" w:line="240" w:before="0" w:after="0"/>
+        <w:jc w:val="left"/>
+        <w:rPr>
+          <w:rFonts w:ascii="Arial Narrow" w:hAnsi="Arial Narrow" w:eastAsia="Times New Roman" w:cs="Arial"/>
+          <w:color w:val="000000"/>
+          <w:kern w:val="0"/>
+          <w:lang w:eastAsia="pt-BR"/>
+          <w14:ligatures w14:val="none"/>
+        </w:rPr>
+      </w:pPr>
+      <w:r>
+        <w:rPr>
+          <w:rFonts w:eastAsia="Times New Roman" w:cs="Arial" w:ascii="Arial Narrow" w:hAnsi="Arial Narrow"/>
+          <w:color w:val="000000"/>
+          <w:kern w:val="0"/>
+          <w:lang w:eastAsia="pt-BR"/>
+          <w14:ligatures w14:val="none"/>
+        </w:rPr>
+      </w:r>
+    </w:p>
+    <w:p>
+      <w:pPr>
+        <w:pStyle w:val="Normal"/>
+        <w:spacing w:lineRule="auto" w:line="240" w:before="0" w:after="0"/>
+        <w:jc w:val="left"/>
+        <w:rPr/>
       </w:pPr>
       <w:r>
         <w:rPr>
@@ -1269,7 +1397,7 @@
           <w:lang w:eastAsia="pt-BR"/>
           <w14:ligatures w14:val="none"/>
         </w:rPr>
-        <w:t xml:space="preserve">2.  </w:t>
+        <w:t xml:space="preserve">5. </w:t>
       </w:r>
       <w:r>
         <w:rPr>
@@ -1281,16 +1409,42 @@
           <w:lang w:eastAsia="pt-BR"/>
           <w14:ligatures w14:val="none"/>
         </w:rPr>
-        <w:t>{{Questão 2 aqui}}</w:t>
-      </w:r>
-    </w:p>
-    <w:p>
-      <w:pPr>
-        <w:pStyle w:val="Normal"/>
-        <w:spacing w:lineRule="auto" w:line="240" w:before="0" w:after="0"/>
-        <w:jc w:val="both"/>
+        <w:t>{{Questão 5 aqui}}</w:t>
+      </w:r>
+    </w:p>
+    <w:p>
+      <w:pPr>
+        <w:pStyle w:val="Normal"/>
+        <w:spacing w:lineRule="auto" w:line="240" w:before="0" w:after="0"/>
+        <w:jc w:val="left"/>
         <w:rPr>
           <w:rFonts w:ascii="Arial Narrow" w:hAnsi="Arial Narrow" w:eastAsia="Times New Roman" w:cs="Arial"/>
+          <w:color w:val="000000"/>
+          <w:kern w:val="0"/>
+          <w:lang w:eastAsia="pt-BR"/>
+          <w14:ligatures w14:val="none"/>
+        </w:rPr>
+      </w:pPr>
+      <w:r>
+        <w:rPr>
+          <w:rFonts w:eastAsia="Times New Roman" w:cs="Arial" w:ascii="Arial Narrow" w:hAnsi="Arial Narrow"/>
+          <w:color w:val="000000"/>
+          <w:kern w:val="0"/>
+          <w:lang w:eastAsia="pt-BR"/>
+          <w14:ligatures w14:val="none"/>
+        </w:rPr>
+      </w:r>
+    </w:p>
+    <w:p>
+      <w:pPr>
+        <w:pStyle w:val="Normal"/>
+        <w:spacing w:lineRule="auto" w:line="240" w:before="0" w:after="0"/>
+        <w:jc w:val="left"/>
+        <w:rPr/>
+      </w:pPr>
+      <w:r>
+        <w:rPr>
+          <w:rFonts w:eastAsia="Times New Roman" w:cs="Arial" w:ascii="Arial Narrow" w:hAnsi="Arial Narrow"/>
           <w:b/>
           <w:bCs/>
           <w:color w:val="000000"/>
@@ -1298,18 +1452,54 @@
           <w:lang w:eastAsia="pt-BR"/>
           <w14:ligatures w14:val="none"/>
         </w:rPr>
-      </w:pPr>
-      <w:r>
+        <w:t xml:space="preserve">6. </w:t>
+      </w:r>
+      <w:r>
+        <w:rPr>
+          <w:rFonts w:eastAsia="Times New Roman" w:cs="Arial" w:ascii="Arial Narrow" w:hAnsi="Arial Narrow"/>
+          <w:b w:val="false"/>
+          <w:bCs w:val="false"/>
+          <w:color w:val="000000"/>
+          <w:kern w:val="0"/>
+          <w:lang w:eastAsia="pt-BR"/>
+          <w14:ligatures w14:val="none"/>
+        </w:rPr>
+        <w:t>{{Questão 6 aqui}}</w:t>
+      </w:r>
+    </w:p>
+    <w:p>
+      <w:pPr>
+        <w:pStyle w:val="Normal"/>
+        <w:spacing w:lineRule="auto" w:line="240" w:before="0" w:after="0"/>
+        <w:jc w:val="left"/>
+        <w:rPr>
+          <w:rFonts w:ascii="Arial Narrow" w:hAnsi="Arial Narrow" w:eastAsia="Times New Roman" w:cs="Arial"/>
+          <w:color w:val="000000"/>
+          <w:kern w:val="0"/>
+          <w:lang w:eastAsia="pt-BR"/>
+          <w14:ligatures w14:val="none"/>
+        </w:rPr>
+      </w:pPr>
+      <w:r>
+        <w:rPr>
+          <w:rFonts w:eastAsia="Times New Roman" w:cs="Arial" w:ascii="Arial Narrow" w:hAnsi="Arial Narrow"/>
+          <w:color w:val="000000"/>
+          <w:kern w:val="0"/>
+          <w:lang w:eastAsia="pt-BR"/>
+          <w14:ligatures w14:val="none"/>
+        </w:rPr>
+      </w:r>
+    </w:p>
+    <w:p>
+      <w:pPr>
+        <w:pStyle w:val="Normal"/>
+        <w:spacing w:lineRule="auto" w:line="240" w:before="0" w:after="0"/>
+        <w:jc w:val="left"/>
         <w:rPr/>
-      </w:r>
-    </w:p>
-    <w:p>
-      <w:pPr>
-        <w:pStyle w:val="Normal"/>
-        <w:spacing w:lineRule="auto" w:line="240" w:before="0" w:after="0"/>
-        <w:jc w:val="both"/>
-        <w:rPr>
-          <w:rFonts w:ascii="Arial Narrow" w:hAnsi="Arial Narrow" w:eastAsia="Times New Roman" w:cs="Arial"/>
+      </w:pPr>
+      <w:r>
+        <w:rPr>
+          <w:rFonts w:eastAsia="Times New Roman" w:cs="Arial" w:ascii="Arial Narrow" w:hAnsi="Arial Narrow"/>
           <w:b/>
           <w:bCs/>
           <w:color w:val="000000"/>
@@ -1317,6 +1507,27 @@
           <w:lang w:eastAsia="pt-BR"/>
           <w14:ligatures w14:val="none"/>
         </w:rPr>
+        <w:t xml:space="preserve">7. </w:t>
+      </w:r>
+      <w:r>
+        <w:rPr>
+          <w:rFonts w:eastAsia="Times New Roman" w:cs="Arial" w:ascii="Arial Narrow" w:hAnsi="Arial Narrow"/>
+          <w:b w:val="false"/>
+          <w:bCs w:val="false"/>
+          <w:color w:val="000000"/>
+          <w:kern w:val="0"/>
+          <w:lang w:eastAsia="pt-BR"/>
+          <w14:ligatures w14:val="none"/>
+        </w:rPr>
+        <w:t>{{Questão 7 aqui}}</w:t>
+      </w:r>
+    </w:p>
+    <w:p>
+      <w:pPr>
+        <w:pStyle w:val="Normal"/>
+        <w:spacing w:lineRule="auto" w:line="240" w:before="0" w:after="0"/>
+        <w:jc w:val="left"/>
+        <w:rPr/>
       </w:pPr>
       <w:r>
         <w:rPr>
@@ -1328,7 +1539,7 @@
           <w:lang w:eastAsia="pt-BR"/>
           <w14:ligatures w14:val="none"/>
         </w:rPr>
-        <w:t xml:space="preserve">3. </w:t>
+        <w:t xml:space="preserve">8. </w:t>
       </w:r>
       <w:r>
         <w:rPr>
@@ -1340,14 +1551,14 @@
           <w:lang w:eastAsia="pt-BR"/>
           <w14:ligatures w14:val="none"/>
         </w:rPr>
-        <w:t>{{Questão 3 aqui}}</w:t>
-      </w:r>
-    </w:p>
-    <w:p>
-      <w:pPr>
-        <w:pStyle w:val="Normal"/>
-        <w:spacing w:lineRule="auto" w:line="240" w:before="0" w:after="0"/>
-        <w:jc w:val="both"/>
+        <w:t>{{Questão 8 aqui}}</w:t>
+      </w:r>
+    </w:p>
+    <w:p>
+      <w:pPr>
+        <w:pStyle w:val="Normal"/>
+        <w:spacing w:lineRule="auto" w:line="240" w:before="0" w:after="0"/>
+        <w:jc w:val="left"/>
         <w:rPr>
           <w:rFonts w:ascii="Arial Narrow" w:hAnsi="Arial Narrow" w:eastAsia="Times New Roman" w:cs="Arial"/>
           <w:color w:val="000000"/>
@@ -1370,9 +1581,12 @@
       <w:pPr>
         <w:pStyle w:val="Normal"/>
         <w:spacing w:lineRule="auto" w:line="240" w:before="0" w:after="0"/>
-        <w:jc w:val="both"/>
-        <w:rPr>
-          <w:rFonts w:ascii="Arial Narrow" w:hAnsi="Arial Narrow" w:eastAsia="Times New Roman" w:cs="Arial"/>
+        <w:jc w:val="left"/>
+        <w:rPr/>
+      </w:pPr>
+      <w:r>
+        <w:rPr>
+          <w:rFonts w:eastAsia="Times New Roman" w:cs="Arial" w:ascii="Arial Narrow" w:hAnsi="Arial Narrow"/>
           <w:b/>
           <w:bCs/>
           <w:color w:val="000000"/>
@@ -1380,6 +1594,50 @@
           <w:lang w:eastAsia="pt-BR"/>
           <w14:ligatures w14:val="none"/>
         </w:rPr>
+        <w:t xml:space="preserve">9. </w:t>
+      </w:r>
+      <w:r>
+        <w:rPr>
+          <w:rFonts w:eastAsia="Times New Roman" w:cs="Arial" w:ascii="Arial Narrow" w:hAnsi="Arial Narrow"/>
+          <w:b w:val="false"/>
+          <w:bCs w:val="false"/>
+          <w:color w:val="000000"/>
+          <w:kern w:val="0"/>
+          <w:lang w:eastAsia="pt-BR"/>
+          <w14:ligatures w14:val="none"/>
+        </w:rPr>
+        <w:t>{{Questão 9 aqui}}</w:t>
+      </w:r>
+    </w:p>
+    <w:p>
+      <w:pPr>
+        <w:pStyle w:val="Normal"/>
+        <w:spacing w:lineRule="auto" w:line="240" w:before="0" w:after="0"/>
+        <w:jc w:val="left"/>
+        <w:rPr>
+          <w:rFonts w:ascii="Arial Narrow" w:hAnsi="Arial Narrow" w:eastAsia="Times New Roman" w:cs="Arial"/>
+          <w:color w:val="000000"/>
+          <w:kern w:val="0"/>
+          <w:lang w:eastAsia="pt-BR"/>
+          <w14:ligatures w14:val="none"/>
+        </w:rPr>
+      </w:pPr>
+      <w:r>
+        <w:rPr>
+          <w:rFonts w:eastAsia="Times New Roman" w:cs="Arial" w:ascii="Arial Narrow" w:hAnsi="Arial Narrow"/>
+          <w:color w:val="000000"/>
+          <w:kern w:val="0"/>
+          <w:lang w:eastAsia="pt-BR"/>
+          <w14:ligatures w14:val="none"/>
+        </w:rPr>
+      </w:r>
+    </w:p>
+    <w:p>
+      <w:pPr>
+        <w:pStyle w:val="Normal"/>
+        <w:spacing w:lineRule="auto" w:line="240" w:before="0" w:after="0"/>
+        <w:jc w:val="left"/>
+        <w:rPr/>
       </w:pPr>
       <w:r>
         <w:rPr>
@@ -1391,7 +1649,7 @@
           <w:lang w:eastAsia="pt-BR"/>
           <w14:ligatures w14:val="none"/>
         </w:rPr>
-        <w:t xml:space="preserve">4. </w:t>
+        <w:t xml:space="preserve">10. </w:t>
       </w:r>
       <w:r>
         <w:rPr>
@@ -1403,14 +1661,14 @@
           <w:lang w:eastAsia="pt-BR"/>
           <w14:ligatures w14:val="none"/>
         </w:rPr>
-        <w:t>{{Questão 4 aqui}}</w:t>
-      </w:r>
-    </w:p>
-    <w:p>
-      <w:pPr>
-        <w:pStyle w:val="Normal"/>
-        <w:spacing w:lineRule="auto" w:line="240" w:before="0" w:after="0"/>
-        <w:jc w:val="both"/>
+        <w:t>{{Questão 10 aqui}}</w:t>
+      </w:r>
+    </w:p>
+    <w:p>
+      <w:pPr>
+        <w:pStyle w:val="Normal"/>
+        <w:spacing w:lineRule="auto" w:line="240" w:before="0" w:after="0"/>
+        <w:jc w:val="left"/>
         <w:rPr>
           <w:rFonts w:ascii="Arial Narrow" w:hAnsi="Arial Narrow" w:eastAsia="Times New Roman" w:cs="Arial"/>
           <w:color w:val="000000"/>
@@ -1433,9 +1691,12 @@
       <w:pPr>
         <w:pStyle w:val="Normal"/>
         <w:spacing w:lineRule="auto" w:line="240" w:before="0" w:after="0"/>
-        <w:jc w:val="both"/>
-        <w:rPr>
-          <w:rFonts w:ascii="Arial Narrow" w:hAnsi="Arial Narrow" w:eastAsia="Times New Roman" w:cs="Arial"/>
+        <w:jc w:val="left"/>
+        <w:rPr/>
+      </w:pPr>
+      <w:r>
+        <w:rPr>
+          <w:rFonts w:eastAsia="Times New Roman" w:cs="Arial" w:ascii="Arial Narrow" w:hAnsi="Arial Narrow"/>
           <w:b/>
           <w:bCs/>
           <w:color w:val="000000"/>
@@ -1443,18 +1704,7 @@
           <w:lang w:eastAsia="pt-BR"/>
           <w14:ligatures w14:val="none"/>
         </w:rPr>
-      </w:pPr>
-      <w:r>
-        <w:rPr>
-          <w:rFonts w:eastAsia="Times New Roman" w:cs="Arial" w:ascii="Arial Narrow" w:hAnsi="Arial Narrow"/>
-          <w:b/>
-          <w:bCs/>
-          <w:color w:val="000000"/>
-          <w:kern w:val="0"/>
-          <w:lang w:eastAsia="pt-BR"/>
-          <w14:ligatures w14:val="none"/>
-        </w:rPr>
-        <w:t xml:space="preserve">5. </w:t>
+        <w:t xml:space="preserve">11. </w:t>
       </w:r>
       <w:r>
         <w:rPr>
@@ -1466,385 +1716,6 @@
           <w:lang w:eastAsia="pt-BR"/>
           <w14:ligatures w14:val="none"/>
         </w:rPr>
-        <w:t>{{Questão 5 aqui}}</w:t>
-      </w:r>
-    </w:p>
-    <w:p>
-      <w:pPr>
-        <w:pStyle w:val="Normal"/>
-        <w:spacing w:lineRule="auto" w:line="240" w:before="0" w:after="0"/>
-        <w:jc w:val="both"/>
-        <w:rPr>
-          <w:rFonts w:ascii="Arial Narrow" w:hAnsi="Arial Narrow" w:eastAsia="Times New Roman" w:cs="Arial"/>
-          <w:color w:val="000000"/>
-          <w:kern w:val="0"/>
-          <w:lang w:eastAsia="pt-BR"/>
-          <w14:ligatures w14:val="none"/>
-        </w:rPr>
-      </w:pPr>
-      <w:r>
-        <w:rPr>
-          <w:rFonts w:eastAsia="Times New Roman" w:cs="Arial" w:ascii="Arial Narrow" w:hAnsi="Arial Narrow"/>
-          <w:color w:val="000000"/>
-          <w:kern w:val="0"/>
-          <w:lang w:eastAsia="pt-BR"/>
-          <w14:ligatures w14:val="none"/>
-        </w:rPr>
-      </w:r>
-    </w:p>
-    <w:p>
-      <w:pPr>
-        <w:pStyle w:val="Normal"/>
-        <w:spacing w:lineRule="auto" w:line="240" w:before="0" w:after="0"/>
-        <w:jc w:val="both"/>
-        <w:rPr>
-          <w:rFonts w:ascii="Arial Narrow" w:hAnsi="Arial Narrow" w:eastAsia="Times New Roman" w:cs="Arial"/>
-          <w:b/>
-          <w:bCs/>
-          <w:color w:val="000000"/>
-          <w:kern w:val="0"/>
-          <w:lang w:eastAsia="pt-BR"/>
-          <w14:ligatures w14:val="none"/>
-        </w:rPr>
-      </w:pPr>
-      <w:r>
-        <w:rPr>
-          <w:rFonts w:eastAsia="Times New Roman" w:cs="Arial" w:ascii="Arial Narrow" w:hAnsi="Arial Narrow"/>
-          <w:b/>
-          <w:bCs/>
-          <w:color w:val="000000"/>
-          <w:kern w:val="0"/>
-          <w:lang w:eastAsia="pt-BR"/>
-          <w14:ligatures w14:val="none"/>
-        </w:rPr>
-        <w:t xml:space="preserve">6. </w:t>
-      </w:r>
-      <w:r>
-        <w:rPr>
-          <w:rFonts w:eastAsia="Times New Roman" w:cs="Arial" w:ascii="Arial Narrow" w:hAnsi="Arial Narrow"/>
-          <w:b w:val="false"/>
-          <w:bCs w:val="false"/>
-          <w:color w:val="000000"/>
-          <w:kern w:val="0"/>
-          <w:lang w:eastAsia="pt-BR"/>
-          <w14:ligatures w14:val="none"/>
-        </w:rPr>
-        <w:t>{{Questão 6 aqui}}</w:t>
-      </w:r>
-    </w:p>
-    <w:p>
-      <w:pPr>
-        <w:pStyle w:val="Normal"/>
-        <w:spacing w:lineRule="auto" w:line="240" w:before="0" w:after="0"/>
-        <w:jc w:val="both"/>
-        <w:rPr>
-          <w:rFonts w:ascii="Arial Narrow" w:hAnsi="Arial Narrow" w:eastAsia="Times New Roman" w:cs="Arial"/>
-          <w:color w:val="000000"/>
-          <w:kern w:val="0"/>
-          <w:lang w:eastAsia="pt-BR"/>
-          <w14:ligatures w14:val="none"/>
-        </w:rPr>
-      </w:pPr>
-      <w:r>
-        <w:rPr>
-          <w:rFonts w:eastAsia="Times New Roman" w:cs="Arial" w:ascii="Arial Narrow" w:hAnsi="Arial Narrow"/>
-          <w:color w:val="000000"/>
-          <w:kern w:val="0"/>
-          <w:lang w:eastAsia="pt-BR"/>
-          <w14:ligatures w14:val="none"/>
-        </w:rPr>
-      </w:r>
-    </w:p>
-    <w:p>
-      <w:pPr>
-        <w:pStyle w:val="Normal"/>
-        <w:spacing w:lineRule="auto" w:line="240" w:before="0" w:after="0"/>
-        <w:jc w:val="both"/>
-        <w:rPr>
-          <w:rFonts w:ascii="Arial Narrow" w:hAnsi="Arial Narrow" w:eastAsia="Times New Roman" w:cs="Arial"/>
-          <w:b/>
-          <w:bCs/>
-          <w:color w:val="000000"/>
-          <w:kern w:val="0"/>
-          <w:lang w:eastAsia="pt-BR"/>
-          <w14:ligatures w14:val="none"/>
-        </w:rPr>
-      </w:pPr>
-      <w:r>
-        <w:rPr>
-          <w:rFonts w:eastAsia="Times New Roman" w:cs="Arial" w:ascii="Arial Narrow" w:hAnsi="Arial Narrow"/>
-          <w:b/>
-          <w:bCs/>
-          <w:color w:val="000000"/>
-          <w:kern w:val="0"/>
-          <w:lang w:eastAsia="pt-BR"/>
-          <w14:ligatures w14:val="none"/>
-        </w:rPr>
-        <w:t xml:space="preserve">7. </w:t>
-      </w:r>
-      <w:r>
-        <w:rPr>
-          <w:rFonts w:eastAsia="Times New Roman" w:cs="Arial" w:ascii="Arial Narrow" w:hAnsi="Arial Narrow"/>
-          <w:b w:val="false"/>
-          <w:bCs w:val="false"/>
-          <w:color w:val="000000"/>
-          <w:kern w:val="0"/>
-          <w:lang w:eastAsia="pt-BR"/>
-          <w14:ligatures w14:val="none"/>
-        </w:rPr>
-        <w:t>{{Questão 7 aqui}}</w:t>
-      </w:r>
-    </w:p>
-    <w:p>
-      <w:pPr>
-        <w:pStyle w:val="Normal"/>
-        <w:spacing w:lineRule="auto" w:line="240" w:before="0" w:after="0"/>
-        <w:jc w:val="both"/>
-        <w:rPr>
-          <w:rFonts w:ascii="Arial Narrow" w:hAnsi="Arial Narrow" w:eastAsia="Times New Roman" w:cs="Arial"/>
-          <w:b/>
-          <w:bCs/>
-          <w:color w:val="000000"/>
-          <w:kern w:val="0"/>
-          <w:lang w:eastAsia="pt-BR"/>
-          <w14:ligatures w14:val="none"/>
-        </w:rPr>
-      </w:pPr>
-      <w:r>
-        <w:rPr>
-          <w:rFonts w:eastAsia="Times New Roman" w:cs="Arial" w:ascii="Arial Narrow" w:hAnsi="Arial Narrow"/>
-          <w:b/>
-          <w:bCs/>
-          <w:color w:val="000000"/>
-          <w:kern w:val="0"/>
-          <w:lang w:eastAsia="pt-BR"/>
-          <w14:ligatures w14:val="none"/>
-        </w:rPr>
-        <w:t xml:space="preserve">8. </w:t>
-      </w:r>
-      <w:r>
-        <w:rPr>
-          <w:rFonts w:eastAsia="Times New Roman" w:cs="Arial" w:ascii="Arial Narrow" w:hAnsi="Arial Narrow"/>
-          <w:b w:val="false"/>
-          <w:bCs w:val="false"/>
-          <w:color w:val="000000"/>
-          <w:kern w:val="0"/>
-          <w:lang w:eastAsia="pt-BR"/>
-          <w14:ligatures w14:val="none"/>
-        </w:rPr>
-        <w:t>{{Questão 8 aqui}}</w:t>
-      </w:r>
-    </w:p>
-    <w:p>
-      <w:pPr>
-        <w:pStyle w:val="Normal"/>
-        <w:spacing w:lineRule="auto" w:line="240" w:before="0" w:after="0"/>
-        <w:jc w:val="both"/>
-        <w:rPr>
-          <w:rFonts w:ascii="Arial Narrow" w:hAnsi="Arial Narrow" w:eastAsia="Times New Roman" w:cs="Arial"/>
-          <w:color w:val="000000"/>
-          <w:kern w:val="0"/>
-          <w:lang w:eastAsia="pt-BR"/>
-          <w14:ligatures w14:val="none"/>
-        </w:rPr>
-      </w:pPr>
-      <w:r>
-        <w:rPr>
-          <w:rFonts w:eastAsia="Times New Roman" w:cs="Arial" w:ascii="Arial Narrow" w:hAnsi="Arial Narrow"/>
-          <w:color w:val="000000"/>
-          <w:kern w:val="0"/>
-          <w:lang w:eastAsia="pt-BR"/>
-          <w14:ligatures w14:val="none"/>
-        </w:rPr>
-      </w:r>
-    </w:p>
-    <w:p>
-      <w:pPr>
-        <w:pStyle w:val="Normal"/>
-        <w:spacing w:lineRule="auto" w:line="240" w:before="0" w:after="0"/>
-        <w:jc w:val="both"/>
-        <w:rPr>
-          <w:rFonts w:ascii="Arial Narrow" w:hAnsi="Arial Narrow" w:eastAsia="Times New Roman" w:cs="Arial"/>
-          <w:b/>
-          <w:bCs/>
-          <w:color w:val="000000"/>
-          <w:kern w:val="0"/>
-          <w:lang w:eastAsia="pt-BR"/>
-          <w14:ligatures w14:val="none"/>
-        </w:rPr>
-      </w:pPr>
-      <w:r>
-        <w:rPr>
-          <w:rFonts w:eastAsia="Times New Roman" w:cs="Arial" w:ascii="Arial Narrow" w:hAnsi="Arial Narrow"/>
-          <w:b/>
-          <w:bCs/>
-          <w:color w:val="000000"/>
-          <w:kern w:val="0"/>
-          <w:lang w:eastAsia="pt-BR"/>
-          <w14:ligatures w14:val="none"/>
-        </w:rPr>
-        <w:t xml:space="preserve">9. </w:t>
-      </w:r>
-      <w:r>
-        <w:rPr>
-          <w:rFonts w:eastAsia="Times New Roman" w:cs="Arial" w:ascii="Arial Narrow" w:hAnsi="Arial Narrow"/>
-          <w:b w:val="false"/>
-          <w:bCs w:val="false"/>
-          <w:color w:val="000000"/>
-          <w:kern w:val="0"/>
-          <w:lang w:eastAsia="pt-BR"/>
-          <w14:ligatures w14:val="none"/>
-        </w:rPr>
-        <w:t>{{Questão 9 aqui}}</w:t>
-      </w:r>
-    </w:p>
-    <w:p>
-      <w:pPr>
-        <w:pStyle w:val="Normal"/>
-        <w:spacing w:lineRule="auto" w:line="240" w:before="0" w:after="0"/>
-        <w:jc w:val="both"/>
-        <w:rPr>
-          <w:rFonts w:ascii="Arial Narrow" w:hAnsi="Arial Narrow" w:eastAsia="Times New Roman" w:cs="Arial"/>
-          <w:color w:val="000000"/>
-          <w:kern w:val="0"/>
-          <w:lang w:eastAsia="pt-BR"/>
-          <w14:ligatures w14:val="none"/>
-        </w:rPr>
-      </w:pPr>
-      <w:r>
-        <w:rPr>
-          <w:rFonts w:eastAsia="Times New Roman" w:cs="Arial" w:ascii="Arial Narrow" w:hAnsi="Arial Narrow"/>
-          <w:color w:val="000000"/>
-          <w:kern w:val="0"/>
-          <w:lang w:eastAsia="pt-BR"/>
-          <w14:ligatures w14:val="none"/>
-        </w:rPr>
-      </w:r>
-    </w:p>
-    <w:p>
-      <w:pPr>
-        <w:pStyle w:val="Normal"/>
-        <w:spacing w:lineRule="auto" w:line="240" w:before="0" w:after="0"/>
-        <w:jc w:val="both"/>
-        <w:rPr>
-          <w:rFonts w:ascii="Arial Narrow" w:hAnsi="Arial Narrow" w:eastAsia="Times New Roman" w:cs="Arial"/>
-          <w:b/>
-          <w:bCs/>
-          <w:color w:val="000000"/>
-          <w:kern w:val="0"/>
-          <w:lang w:eastAsia="pt-BR"/>
-          <w14:ligatures w14:val="none"/>
-        </w:rPr>
-      </w:pPr>
-      <w:r>
-        <w:rPr>
-          <w:rFonts w:eastAsia="Times New Roman" w:cs="Arial" w:ascii="Arial Narrow" w:hAnsi="Arial Narrow"/>
-          <w:b/>
-          <w:bCs/>
-          <w:color w:val="000000"/>
-          <w:kern w:val="0"/>
-          <w:lang w:eastAsia="pt-BR"/>
-          <w14:ligatures w14:val="none"/>
-        </w:rPr>
-        <w:t xml:space="preserve">10. </w:t>
-      </w:r>
-      <w:r>
-        <w:rPr>
-          <w:rFonts w:eastAsia="Times New Roman" w:cs="Arial" w:ascii="Arial Narrow" w:hAnsi="Arial Narrow"/>
-          <w:b w:val="false"/>
-          <w:bCs w:val="false"/>
-          <w:color w:val="000000"/>
-          <w:kern w:val="0"/>
-          <w:lang w:eastAsia="pt-BR"/>
-          <w14:ligatures w14:val="none"/>
-        </w:rPr>
-        <w:t>{{Questão 10 aqui}}</w:t>
-      </w:r>
-    </w:p>
-    <w:p>
-      <w:pPr>
-        <w:pStyle w:val="Normal"/>
-        <w:spacing w:lineRule="auto" w:line="240" w:before="0" w:after="0"/>
-        <w:jc w:val="both"/>
-        <w:rPr>
-          <w:rFonts w:ascii="Arial Narrow" w:hAnsi="Arial Narrow" w:eastAsia="Times New Roman" w:cs="Arial"/>
-          <w:color w:val="000000"/>
-          <w:kern w:val="0"/>
-          <w:lang w:eastAsia="pt-BR"/>
-          <w14:ligatures w14:val="none"/>
-        </w:rPr>
-      </w:pPr>
-      <w:r>
-        <w:rPr>
-          <w:rFonts w:eastAsia="Times New Roman" w:cs="Arial" w:ascii="Arial Narrow" w:hAnsi="Arial Narrow"/>
-          <w:color w:val="000000"/>
-          <w:kern w:val="0"/>
-          <w:lang w:eastAsia="pt-BR"/>
-          <w14:ligatures w14:val="none"/>
-        </w:rPr>
-      </w:r>
-    </w:p>
-    <w:p>
-      <w:pPr>
-        <w:pStyle w:val="Normal"/>
-        <w:spacing w:lineRule="auto" w:line="240" w:before="0" w:after="0"/>
-        <w:jc w:val="both"/>
-        <w:rPr>
-          <w:rFonts w:ascii="Arial Narrow" w:hAnsi="Arial Narrow" w:eastAsia="Times New Roman" w:cs="Arial"/>
-          <w:b/>
-          <w:bCs/>
-          <w:color w:val="000000"/>
-          <w:kern w:val="0"/>
-          <w:lang w:eastAsia="pt-BR"/>
-          <w14:ligatures w14:val="none"/>
-        </w:rPr>
-      </w:pPr>
-      <w:r>
-        <w:rPr>
-          <w:rFonts w:eastAsia="Times New Roman" w:cs="Arial" w:ascii="Arial Narrow" w:hAnsi="Arial Narrow"/>
-          <w:b/>
-          <w:bCs/>
-          <w:color w:val="000000"/>
-          <w:kern w:val="0"/>
-          <w:lang w:eastAsia="pt-BR"/>
-          <w14:ligatures w14:val="none"/>
-        </w:rPr>
-        <w:t>1</w:t>
-      </w:r>
-      <w:r>
-        <w:rPr>
-          <w:rFonts w:eastAsia="Times New Roman" w:cs="Arial" w:ascii="Arial Narrow" w:hAnsi="Arial Narrow"/>
-          <w:b/>
-          <w:bCs/>
-          <w:color w:val="000000"/>
-          <w:kern w:val="0"/>
-          <w:lang w:eastAsia="pt-BR"/>
-          <w14:ligatures w14:val="none"/>
-        </w:rPr>
-        <w:t>1</w:t>
-      </w:r>
-      <w:r>
-        <w:rPr>
-          <w:rFonts w:eastAsia="Times New Roman" w:cs="Arial" w:ascii="Arial Narrow" w:hAnsi="Arial Narrow"/>
-          <w:b/>
-          <w:bCs/>
-          <w:color w:val="000000"/>
-          <w:kern w:val="0"/>
-          <w:lang w:eastAsia="pt-BR"/>
-          <w14:ligatures w14:val="none"/>
-        </w:rPr>
-        <w:t xml:space="preserve">. </w:t>
-      </w:r>
-      <w:r>
-        <w:rPr>
-          <w:rFonts w:eastAsia="Times New Roman" w:cs="Arial" w:ascii="Arial Narrow" w:hAnsi="Arial Narrow"/>
-          <w:b w:val="false"/>
-          <w:bCs w:val="false"/>
-          <w:color w:val="000000"/>
-          <w:kern w:val="0"/>
-          <w:lang w:eastAsia="pt-BR"/>
-          <w14:ligatures w14:val="none"/>
-        </w:rPr>
         <w:t>{{Questão 11 aqui}}</w:t>
       </w:r>
     </w:p>
@@ -1854,7 +1725,7 @@
         <w:spacing w:lineRule="auto" w:line="240" w:before="0" w:after="0"/>
         <w:ind w:left="360"/>
         <w:contextualSpacing/>
-        <w:jc w:val="both"/>
+        <w:jc w:val="left"/>
         <w:rPr>
           <w:rFonts w:ascii="Arial Narrow" w:hAnsi="Arial Narrow" w:eastAsia="Times New Roman" w:cs="Arial"/>
           <w:color w:val="000000"/>
@@ -2560,7 +2431,13 @@
         </w:rPr>
       </w:pPr>
       <w:r>
-        <w:rPr/>
+        <w:rPr>
+          <w:rFonts w:eastAsia="Times New Roman" w:cs="Arial" w:ascii="Arial Narrow" w:hAnsi="Arial Narrow"/>
+          <w:color w:val="000000"/>
+          <w:kern w:val="0"/>
+          <w:lang w:eastAsia="pt-BR"/>
+          <w14:ligatures w14:val="none"/>
+        </w:rPr>
       </w:r>
     </w:p>
     <w:p>
@@ -2576,11 +2453,24 @@
         </w:sectPr>
       </w:pPr>
     </w:p>
+    <w:p>
+      <w:pPr>
+        <w:pStyle w:val="Normal"/>
+        <w:widowControl/>
+        <w:suppressAutoHyphens w:val="true"/>
+        <w:bidi w:val="0"/>
+        <w:spacing w:lineRule="auto" w:line="276" w:before="0" w:after="160"/>
+        <w:jc w:val="left"/>
+        <w:rPr/>
+      </w:pPr>
+      <w:r>
+        <w:rPr/>
+      </w:r>
+    </w:p>
     <w:sectPr>
       <w:type w:val="continuous"/>
       <w:pgSz w:w="11906" w:h="16838"/>
       <w:pgMar w:left="737" w:right="737" w:gutter="0" w:header="0" w:top="737" w:footer="708" w:bottom="765"/>
-      <w:pgNumType w:fmt="decimal"/>
       <w:formProt w:val="false"/>
       <w:textDirection w:val="lrTb"/>
       <w:docGrid w:type="default" w:linePitch="360" w:charSpace="0"/>
@@ -2656,7 +2546,7 @@
           <w:rPr>
             <w:rFonts w:cs="Arial" w:ascii="Arial" w:hAnsi="Arial"/>
           </w:rPr>
-          <w:t>1</w:t>
+          <w:t>2</w:t>
         </w:r>
         <w:r>
           <w:rPr>
@@ -2723,7 +2613,7 @@
           <w:rPr>
             <w:rFonts w:cs="Arial" w:ascii="Arial" w:hAnsi="Arial"/>
           </w:rPr>
-          <w:t>1</w:t>
+          <w:t>2</w:t>
         </w:r>
         <w:r>
           <w:rPr>
@@ -3406,6 +3296,7 @@
     <w:qFormat/>
     <w:pPr>
       <w:widowControl/>
+      <w:suppressAutoHyphens w:val="true"/>
       <w:bidi w:val="0"/>
       <w:spacing w:lineRule="auto" w:line="276" w:before="0" w:after="160"/>
       <w:jc w:val="left"/>

</xml_diff>

<commit_message>
atualiza Modelo_AR2.docx com placeholder {{simbolo aqui}} no rodapé
Co-Authored-By: Claude Sonnet 4.6 <noreply@anthropic.com>
</commit_message>
<xml_diff>
--- a/Modelo_AR2.docx
+++ b/Modelo_AR2.docx
@@ -622,7 +622,7 @@
           <w:lang w:val="pt-PT" w:eastAsia="pt-BR"/>
           <w14:ligatures w14:val="none"/>
         </w:rPr>
-        <w:t>–</w:t>
+        <w:t>{{simbolo aqui}}</w:t>
       </w:r>
       <w:r>
         <w:rPr>
@@ -670,7 +670,7 @@
           <w:lang w:val="pt-PT" w:eastAsia="pt-BR"/>
           <w14:ligatures w14:val="none"/>
         </w:rPr>
-        <w:t>–</w:t>
+        <w:t>{{simbolo aqui}}</w:t>
       </w:r>
       <w:r>
         <w:rPr>
@@ -2431,13 +2431,7 @@
         </w:rPr>
       </w:pPr>
       <w:r>
-        <w:rPr>
-          <w:rFonts w:eastAsia="Times New Roman" w:cs="Arial" w:ascii="Arial Narrow" w:hAnsi="Arial Narrow"/>
-          <w:color w:val="000000"/>
-          <w:kern w:val="0"/>
-          <w:lang w:eastAsia="pt-BR"/>
-          <w14:ligatures w14:val="none"/>
-        </w:rPr>
+        <w:rPr/>
       </w:r>
     </w:p>
     <w:p>
@@ -2453,24 +2447,11 @@
         </w:sectPr>
       </w:pPr>
     </w:p>
-    <w:p>
-      <w:pPr>
-        <w:pStyle w:val="Normal"/>
-        <w:widowControl/>
-        <w:suppressAutoHyphens w:val="true"/>
-        <w:bidi w:val="0"/>
-        <w:spacing w:lineRule="auto" w:line="276" w:before="0" w:after="160"/>
-        <w:jc w:val="left"/>
-        <w:rPr/>
-      </w:pPr>
-      <w:r>
-        <w:rPr/>
-      </w:r>
-    </w:p>
     <w:sectPr>
       <w:type w:val="continuous"/>
       <w:pgSz w:w="11906" w:h="16838"/>
       <w:pgMar w:left="737" w:right="737" w:gutter="0" w:header="0" w:top="737" w:footer="708" w:bottom="765"/>
+      <w:pgNumType w:fmt="decimal"/>
       <w:formProt w:val="false"/>
       <w:textDirection w:val="lrTb"/>
       <w:docGrid w:type="default" w:linePitch="360" w:charSpace="0"/>
@@ -2516,18 +2497,6 @@
           <w:rPr>
             <w:rFonts w:cs="Arial" w:ascii="Arial" w:hAnsi="Arial"/>
           </w:rPr>
-          <w:t xml:space="preserve">   </w:t>
-        </w:r>
-        <w:r>
-          <w:rPr>
-            <w:rFonts w:cs="Arial" w:ascii="Arial" w:hAnsi="Arial"/>
-          </w:rPr>
-          <w:t xml:space="preserve">{{Rodape aqui}}                                                                               </w:t>
-        </w:r>
-        <w:r>
-          <w:rPr>
-            <w:rFonts w:cs="Arial" w:ascii="Arial" w:hAnsi="Arial"/>
-          </w:rPr>
           <w:fldChar w:fldCharType="begin"/>
         </w:r>
         <w:r>
@@ -2546,7 +2515,7 @@
           <w:rPr>
             <w:rFonts w:cs="Arial" w:ascii="Arial" w:hAnsi="Arial"/>
           </w:rPr>
-          <w:t>2</w:t>
+          <w:t>1</w:t>
         </w:r>
         <w:r>
           <w:rPr>
@@ -2583,18 +2552,6 @@
           <w:rPr>
             <w:rFonts w:cs="Arial" w:ascii="Arial" w:hAnsi="Arial"/>
           </w:rPr>
-          <w:t xml:space="preserve">   </w:t>
-        </w:r>
-        <w:r>
-          <w:rPr>
-            <w:rFonts w:cs="Arial" w:ascii="Arial" w:hAnsi="Arial"/>
-          </w:rPr>
-          <w:t xml:space="preserve">{{Rodape aqui}}                                                                               </w:t>
-        </w:r>
-        <w:r>
-          <w:rPr>
-            <w:rFonts w:cs="Arial" w:ascii="Arial" w:hAnsi="Arial"/>
-          </w:rPr>
           <w:fldChar w:fldCharType="begin"/>
         </w:r>
         <w:r>
@@ -2613,7 +2570,7 @@
           <w:rPr>
             <w:rFonts w:cs="Arial" w:ascii="Arial" w:hAnsi="Arial"/>
           </w:rPr>
-          <w:t>2</w:t>
+          <w:t>1</w:t>
         </w:r>
         <w:r>
           <w:rPr>

</xml_diff>

<commit_message>
corrige substituição de múltiplos {{simbolo aqui}} no mesmo parágrafo
replace_text_in_paragraph_runs agora percorre todos os runs do parágrafo
ao invés de retornar após o primeiro, substituindo todas as ocorrências.

Co-Authored-By: Claude Sonnet 4.6 <noreply@anthropic.com>
</commit_message>
<xml_diff>
--- a/Modelo_AR2.docx
+++ b/Modelo_AR2.docx
@@ -2431,7 +2431,13 @@
         </w:rPr>
       </w:pPr>
       <w:r>
-        <w:rPr/>
+        <w:rPr>
+          <w:rFonts w:eastAsia="Times New Roman" w:cs="Arial" w:ascii="Arial Narrow" w:hAnsi="Arial Narrow"/>
+          <w:color w:val="000000"/>
+          <w:kern w:val="0"/>
+          <w:lang w:eastAsia="pt-BR"/>
+          <w14:ligatures w14:val="none"/>
+        </w:rPr>
       </w:r>
     </w:p>
     <w:p>
@@ -2447,11 +2453,24 @@
         </w:sectPr>
       </w:pPr>
     </w:p>
+    <w:p>
+      <w:pPr>
+        <w:pStyle w:val="Normal"/>
+        <w:widowControl/>
+        <w:suppressAutoHyphens w:val="true"/>
+        <w:bidi w:val="0"/>
+        <w:spacing w:lineRule="auto" w:line="276" w:before="0" w:after="160"/>
+        <w:jc w:val="left"/>
+        <w:rPr/>
+      </w:pPr>
+      <w:r>
+        <w:rPr/>
+      </w:r>
+    </w:p>
     <w:sectPr>
       <w:type w:val="continuous"/>
       <w:pgSz w:w="11906" w:h="16838"/>
       <w:pgMar w:left="737" w:right="737" w:gutter="0" w:header="0" w:top="737" w:footer="708" w:bottom="765"/>
-      <w:pgNumType w:fmt="decimal"/>
       <w:formProt w:val="false"/>
       <w:textDirection w:val="lrTb"/>
       <w:docGrid w:type="default" w:linePitch="360" w:charSpace="0"/>
@@ -2515,7 +2534,7 @@
           <w:rPr>
             <w:rFonts w:cs="Arial" w:ascii="Arial" w:hAnsi="Arial"/>
           </w:rPr>
-          <w:t>1</w:t>
+          <w:t>2</w:t>
         </w:r>
         <w:r>
           <w:rPr>
@@ -2570,7 +2589,7 @@
           <w:rPr>
             <w:rFonts w:cs="Arial" w:ascii="Arial" w:hAnsi="Arial"/>
           </w:rPr>
-          <w:t>1</w:t>
+          <w:t>2</w:t>
         </w:r>
         <w:r>
           <w:rPr>

</xml_diff>

<commit_message>
adiciona pontuação de cada questão no Modelo_AR2.docx
Co-Authored-By: Claude Sonnet 4.6 <noreply@anthropic.com>
</commit_message>
<xml_diff>
--- a/Modelo_AR2.docx
+++ b/Modelo_AR2.docx
@@ -399,6 +399,67 @@
           <w:lang w:val="pt-PT" w:eastAsia="pt-BR"/>
           <w14:ligatures w14:val="none"/>
         </w:rPr>
+        <mc:AlternateContent>
+          <mc:Choice Requires="wps">
+            <w:drawing>
+              <wp:anchor behindDoc="0" distT="0" distB="0" distL="0" distR="0" simplePos="0" locked="0" layoutInCell="1" allowOverlap="1" relativeHeight="4">
+                <wp:simplePos x="0" y="0"/>
+                <wp:positionH relativeFrom="column">
+                  <wp:posOffset>5541010</wp:posOffset>
+                </wp:positionH>
+                <wp:positionV relativeFrom="paragraph">
+                  <wp:posOffset>278765</wp:posOffset>
+                </wp:positionV>
+                <wp:extent cx="1123950" cy="314325"/>
+                <wp:effectExtent l="635" t="1270" r="1270" b="635"/>
+                <wp:wrapNone/>
+                <wp:docPr id="2" name="Shape 1"/>
+                <a:graphic xmlns:a="http://schemas.openxmlformats.org/drawingml/2006/main">
+                  <a:graphicData uri="http://schemas.microsoft.com/office/word/2010/wordprocessingShape">
+                    <wps:wsp>
+                      <wps:cNvSpPr/>
+                      <wps:spPr>
+                        <a:xfrm>
+                          <a:off x="0" y="0"/>
+                          <a:ext cx="1123920" cy="314280"/>
+                        </a:xfrm>
+                        <a:prstGeom prst="roundRect">
+                          <a:avLst>
+                            <a:gd name="adj" fmla="val 16667"/>
+                          </a:avLst>
+                        </a:prstGeom>
+                        <a:solidFill>
+                          <a:srgbClr val="b2b2b2"/>
+                        </a:solidFill>
+                        <a:ln w="0">
+                          <a:solidFill>
+                            <a:srgbClr val="3465a4"/>
+                          </a:solidFill>
+                        </a:ln>
+                      </wps:spPr>
+                      <wps:style>
+                        <a:lnRef idx="0"/>
+                        <a:fillRef idx="0"/>
+                        <a:effectRef idx="0"/>
+                        <a:fontRef idx="minor"/>
+                      </wps:style>
+                      <wps:bodyPr/>
+                    </wps:wsp>
+                  </a:graphicData>
+                </a:graphic>
+              </wp:anchor>
+            </w:drawing>
+          </mc:Choice>
+          <mc:Fallback>
+            <w:pict>
+              <v:roundrect id="shape_0" ID="Shape 1" fillcolor="#b2b2b2" stroked="t" o:allowincell="f" style="position:absolute;margin-left:436.3pt;margin-top:21.95pt;width:88.45pt;height:24.7pt;mso-wrap-style:none;v-text-anchor:middle">
+                <v:fill o:detectmouseclick="t" color2="#4d4d4d"/>
+                <v:stroke color="#3465a4" joinstyle="round" endcap="flat"/>
+                <w10:wrap type="none"/>
+              </v:roundrect>
+            </w:pict>
+          </mc:Fallback>
+        </mc:AlternateContent>
       </w:r>
     </w:p>
     <w:tbl>
@@ -417,8 +478,8 @@
         <w:tblLook w:val="01e0" w:noHBand="0" w:noVBand="0" w:firstColumn="1" w:lastRow="1" w:lastColumn="1" w:firstRow="1"/>
       </w:tblPr>
       <w:tblGrid>
-        <w:gridCol w:w="4819"/>
-        <w:gridCol w:w="5812"/>
+        <w:gridCol w:w="3570"/>
+        <w:gridCol w:w="7061"/>
       </w:tblGrid>
       <w:tr>
         <w:trPr>
@@ -463,11 +524,11 @@
       </w:tr>
       <w:tr>
         <w:trPr>
-          <w:trHeight w:val="337" w:hRule="atLeast"/>
+          <w:trHeight w:val="458" w:hRule="atLeast"/>
         </w:trPr>
         <w:tc>
           <w:tcPr>
-            <w:tcW w:w="4819" w:type="dxa"/>
+            <w:tcW w:w="3570" w:type="dxa"/>
             <w:tcBorders/>
           </w:tcPr>
           <w:p>
@@ -495,13 +556,33 @@
                 <w:szCs w:val="28"/>
                 <w:lang w:eastAsia="en-US" w:bidi="ar-SA"/>
               </w:rPr>
-              <w:t>CURSO: ____________________________________</w:t>
+              <w:t>CURSO: __________</w:t>
+            </w:r>
+            <w:r>
+              <w:rPr>
+                <w:rFonts w:ascii="Arial Narrow" w:hAnsi="Arial Narrow"/>
+                <w:color w:themeColor="text1" w:val="000000"/>
+                <w:sz w:val="24"/>
+                <w:szCs w:val="28"/>
+                <w:lang w:eastAsia="en-US" w:bidi="ar-SA"/>
+              </w:rPr>
+              <w:t>_</w:t>
+            </w:r>
+            <w:r>
+              <w:rPr>
+                <w:rFonts w:ascii="Arial Narrow" w:hAnsi="Arial Narrow"/>
+                <w:color w:themeColor="text1" w:val="000000"/>
+                <w:sz w:val="24"/>
+                <w:szCs w:val="28"/>
+                <w:lang w:eastAsia="en-US" w:bidi="ar-SA"/>
+              </w:rPr>
+              <w:t>______________</w:t>
             </w:r>
           </w:p>
         </w:tc>
         <w:tc>
           <w:tcPr>
-            <w:tcW w:w="5812" w:type="dxa"/>
+            <w:tcW w:w="7061" w:type="dxa"/>
             <w:tcBorders/>
           </w:tcPr>
           <w:p>
@@ -529,7 +610,27 @@
                 <w:szCs w:val="28"/>
                 <w:lang w:eastAsia="en-US" w:bidi="ar-SA"/>
               </w:rPr>
-              <w:t>SÉRIE:______PERÍODO:_____________DATA:____/____/_____</w:t>
+              <w:t xml:space="preserve">SÉRIE:____PERÍODO:___DATA:____/____/_____ </w:t>
+            </w:r>
+            <w:r>
+              <w:rPr>
+                <w:rFonts w:ascii="Arial Narrow" w:hAnsi="Arial Narrow"/>
+                <w:color w:themeColor="text1" w:val="000000"/>
+                <w:sz w:val="24"/>
+                <w:szCs w:val="28"/>
+                <w:lang w:eastAsia="en-US" w:bidi="ar-SA"/>
+              </w:rPr>
+              <w:t>NO</w:t>
+            </w:r>
+            <w:r>
+              <w:rPr>
+                <w:rFonts w:ascii="Arial Narrow" w:hAnsi="Arial Narrow"/>
+                <w:color w:themeColor="text1" w:val="000000"/>
+                <w:sz w:val="24"/>
+                <w:szCs w:val="28"/>
+                <w:lang w:eastAsia="en-US" w:bidi="ar-SA"/>
+              </w:rPr>
+              <w:t xml:space="preserve">TA: </w:t>
             </w:r>
           </w:p>
         </w:tc>
@@ -1121,7 +1222,7 @@
             <wp:extent cx="3087370" cy="3841115"/>
             <wp:effectExtent l="0" t="0" r="0" b="0"/>
             <wp:wrapSquare wrapText="largest"/>
-            <wp:docPr id="2" name="Image1" descr=""/>
+            <wp:docPr id="3" name="Image1" descr=""/>
             <wp:cNvGraphicFramePr>
               <a:graphicFrameLocks xmlns:a="http://schemas.openxmlformats.org/drawingml/2006/main" noChangeAspect="1"/>
             </wp:cNvGraphicFramePr>
@@ -1129,7 +1230,7 @@
               <a:graphicData uri="http://schemas.openxmlformats.org/drawingml/2006/picture">
                 <pic:pic xmlns:pic="http://schemas.openxmlformats.org/drawingml/2006/picture">
                   <pic:nvPicPr>
-                    <pic:cNvPr id="2" name="Image1" descr=""/>
+                    <pic:cNvPr id="3" name="Image1" descr=""/>
                     <pic:cNvPicPr>
                       <a:picLocks noChangeAspect="1" noChangeArrowheads="1"/>
                     </pic:cNvPicPr>
@@ -1178,6 +1279,30 @@
       <w:r>
         <w:rPr>
           <w:rFonts w:eastAsia="Times New Roman" w:cs="Arial" w:ascii="Arial Narrow" w:hAnsi="Arial Narrow"/>
+          <w:b/>
+          <w:bCs/>
+          <w:color w:val="000000"/>
+          <w:kern w:val="0"/>
+          <w:lang w:eastAsia="pt-BR"/>
+          <w14:ligatures w14:val="none"/>
+        </w:rPr>
+        <w:t>(0,25 pt.)</w:t>
+      </w:r>
+      <w:r>
+        <w:rPr>
+          <w:rFonts w:eastAsia="Times New Roman" w:cs="Arial" w:ascii="Arial Narrow" w:hAnsi="Arial Narrow"/>
+          <w:b/>
+          <w:bCs/>
+          <w:color w:val="000000"/>
+          <w:kern w:val="0"/>
+          <w:lang w:eastAsia="pt-BR"/>
+          <w14:ligatures w14:val="none"/>
+        </w:rPr>
+        <w:t xml:space="preserve"> </w:t>
+      </w:r>
+      <w:r>
+        <w:rPr>
+          <w:rFonts w:eastAsia="Times New Roman" w:cs="Arial" w:ascii="Arial Narrow" w:hAnsi="Arial Narrow"/>
           <w:b w:val="false"/>
           <w:bCs w:val="false"/>
           <w:color w:val="000000"/>
@@ -1228,7 +1353,31 @@
           <w:lang w:eastAsia="pt-BR"/>
           <w14:ligatures w14:val="none"/>
         </w:rPr>
-        <w:t xml:space="preserve">2.  </w:t>
+        <w:t xml:space="preserve">2. </w:t>
+      </w:r>
+      <w:r>
+        <w:rPr>
+          <w:rFonts w:eastAsia="Times New Roman" w:cs="Arial" w:ascii="Arial Narrow" w:hAnsi="Arial Narrow"/>
+          <w:b/>
+          <w:bCs/>
+          <w:color w:val="000000"/>
+          <w:kern w:val="0"/>
+          <w:lang w:eastAsia="pt-BR"/>
+          <w14:ligatures w14:val="none"/>
+        </w:rPr>
+        <w:t>(0,25 pt.)</w:t>
+      </w:r>
+      <w:r>
+        <w:rPr>
+          <w:rFonts w:eastAsia="Times New Roman" w:cs="Arial" w:ascii="Arial Narrow" w:hAnsi="Arial Narrow"/>
+          <w:b/>
+          <w:bCs/>
+          <w:color w:val="000000"/>
+          <w:kern w:val="0"/>
+          <w:lang w:eastAsia="pt-BR"/>
+          <w14:ligatures w14:val="none"/>
+        </w:rPr>
+        <w:t xml:space="preserve">  </w:t>
       </w:r>
       <w:r>
         <w:rPr>
@@ -1292,6 +1441,30 @@
       <w:r>
         <w:rPr>
           <w:rFonts w:eastAsia="Times New Roman" w:cs="Arial" w:ascii="Arial Narrow" w:hAnsi="Arial Narrow"/>
+          <w:b/>
+          <w:bCs/>
+          <w:color w:val="000000"/>
+          <w:kern w:val="0"/>
+          <w:lang w:eastAsia="pt-BR"/>
+          <w14:ligatures w14:val="none"/>
+        </w:rPr>
+        <w:t>(0,25 pt.)</w:t>
+      </w:r>
+      <w:r>
+        <w:rPr>
+          <w:rFonts w:eastAsia="Times New Roman" w:cs="Arial" w:ascii="Arial Narrow" w:hAnsi="Arial Narrow"/>
+          <w:b/>
+          <w:bCs/>
+          <w:color w:val="000000"/>
+          <w:kern w:val="0"/>
+          <w:lang w:eastAsia="pt-BR"/>
+          <w14:ligatures w14:val="none"/>
+        </w:rPr>
+        <w:t xml:space="preserve"> </w:t>
+      </w:r>
+      <w:r>
+        <w:rPr>
+          <w:rFonts w:eastAsia="Times New Roman" w:cs="Arial" w:ascii="Arial Narrow" w:hAnsi="Arial Narrow"/>
           <w:b w:val="false"/>
           <w:bCs w:val="false"/>
           <w:color w:val="000000"/>
@@ -1347,6 +1520,30 @@
       <w:r>
         <w:rPr>
           <w:rFonts w:eastAsia="Times New Roman" w:cs="Arial" w:ascii="Arial Narrow" w:hAnsi="Arial Narrow"/>
+          <w:b/>
+          <w:bCs/>
+          <w:color w:val="000000"/>
+          <w:kern w:val="0"/>
+          <w:lang w:eastAsia="pt-BR"/>
+          <w14:ligatures w14:val="none"/>
+        </w:rPr>
+        <w:t>(0,25 pt.)</w:t>
+      </w:r>
+      <w:r>
+        <w:rPr>
+          <w:rFonts w:eastAsia="Times New Roman" w:cs="Arial" w:ascii="Arial Narrow" w:hAnsi="Arial Narrow"/>
+          <w:b/>
+          <w:bCs/>
+          <w:color w:val="000000"/>
+          <w:kern w:val="0"/>
+          <w:lang w:eastAsia="pt-BR"/>
+          <w14:ligatures w14:val="none"/>
+        </w:rPr>
+        <w:t xml:space="preserve"> </w:t>
+      </w:r>
+      <w:r>
+        <w:rPr>
+          <w:rFonts w:eastAsia="Times New Roman" w:cs="Arial" w:ascii="Arial Narrow" w:hAnsi="Arial Narrow"/>
           <w:b w:val="false"/>
           <w:bCs w:val="false"/>
           <w:color w:val="000000"/>
@@ -1402,6 +1599,30 @@
       <w:r>
         <w:rPr>
           <w:rFonts w:eastAsia="Times New Roman" w:cs="Arial" w:ascii="Arial Narrow" w:hAnsi="Arial Narrow"/>
+          <w:b/>
+          <w:bCs/>
+          <w:color w:val="000000"/>
+          <w:kern w:val="0"/>
+          <w:lang w:eastAsia="pt-BR"/>
+          <w14:ligatures w14:val="none"/>
+        </w:rPr>
+        <w:t>(0,25 pt.)</w:t>
+      </w:r>
+      <w:r>
+        <w:rPr>
+          <w:rFonts w:eastAsia="Times New Roman" w:cs="Arial" w:ascii="Arial Narrow" w:hAnsi="Arial Narrow"/>
+          <w:b/>
+          <w:bCs/>
+          <w:color w:val="000000"/>
+          <w:kern w:val="0"/>
+          <w:lang w:eastAsia="pt-BR"/>
+          <w14:ligatures w14:val="none"/>
+        </w:rPr>
+        <w:t xml:space="preserve"> </w:t>
+      </w:r>
+      <w:r>
+        <w:rPr>
+          <w:rFonts w:eastAsia="Times New Roman" w:cs="Arial" w:ascii="Arial Narrow" w:hAnsi="Arial Narrow"/>
           <w:b w:val="false"/>
           <w:bCs w:val="false"/>
           <w:color w:val="000000"/>
@@ -1457,6 +1678,30 @@
       <w:r>
         <w:rPr>
           <w:rFonts w:eastAsia="Times New Roman" w:cs="Arial" w:ascii="Arial Narrow" w:hAnsi="Arial Narrow"/>
+          <w:b/>
+          <w:bCs/>
+          <w:color w:val="000000"/>
+          <w:kern w:val="0"/>
+          <w:lang w:eastAsia="pt-BR"/>
+          <w14:ligatures w14:val="none"/>
+        </w:rPr>
+        <w:t>(0,25 pt.)</w:t>
+      </w:r>
+      <w:r>
+        <w:rPr>
+          <w:rFonts w:eastAsia="Times New Roman" w:cs="Arial" w:ascii="Arial Narrow" w:hAnsi="Arial Narrow"/>
+          <w:b/>
+          <w:bCs/>
+          <w:color w:val="000000"/>
+          <w:kern w:val="0"/>
+          <w:lang w:eastAsia="pt-BR"/>
+          <w14:ligatures w14:val="none"/>
+        </w:rPr>
+        <w:t xml:space="preserve"> </w:t>
+      </w:r>
+      <w:r>
+        <w:rPr>
+          <w:rFonts w:eastAsia="Times New Roman" w:cs="Arial" w:ascii="Arial Narrow" w:hAnsi="Arial Narrow"/>
           <w:b w:val="false"/>
           <w:bCs w:val="false"/>
           <w:color w:val="000000"/>
@@ -1512,6 +1757,30 @@
       <w:r>
         <w:rPr>
           <w:rFonts w:eastAsia="Times New Roman" w:cs="Arial" w:ascii="Arial Narrow" w:hAnsi="Arial Narrow"/>
+          <w:b/>
+          <w:bCs/>
+          <w:color w:val="000000"/>
+          <w:kern w:val="0"/>
+          <w:lang w:eastAsia="pt-BR"/>
+          <w14:ligatures w14:val="none"/>
+        </w:rPr>
+        <w:t>(0,25 pt.)</w:t>
+      </w:r>
+      <w:r>
+        <w:rPr>
+          <w:rFonts w:eastAsia="Times New Roman" w:cs="Arial" w:ascii="Arial Narrow" w:hAnsi="Arial Narrow"/>
+          <w:b/>
+          <w:bCs/>
+          <w:color w:val="000000"/>
+          <w:kern w:val="0"/>
+          <w:lang w:eastAsia="pt-BR"/>
+          <w14:ligatures w14:val="none"/>
+        </w:rPr>
+        <w:t xml:space="preserve"> </w:t>
+      </w:r>
+      <w:r>
+        <w:rPr>
+          <w:rFonts w:eastAsia="Times New Roman" w:cs="Arial" w:ascii="Arial Narrow" w:hAnsi="Arial Narrow"/>
           <w:b w:val="false"/>
           <w:bCs w:val="false"/>
           <w:color w:val="000000"/>
@@ -1544,6 +1813,30 @@
       <w:r>
         <w:rPr>
           <w:rFonts w:eastAsia="Times New Roman" w:cs="Arial" w:ascii="Arial Narrow" w:hAnsi="Arial Narrow"/>
+          <w:b/>
+          <w:bCs/>
+          <w:color w:val="000000"/>
+          <w:kern w:val="0"/>
+          <w:lang w:eastAsia="pt-BR"/>
+          <w14:ligatures w14:val="none"/>
+        </w:rPr>
+        <w:t>(0,25 pt.)</w:t>
+      </w:r>
+      <w:r>
+        <w:rPr>
+          <w:rFonts w:eastAsia="Times New Roman" w:cs="Arial" w:ascii="Arial Narrow" w:hAnsi="Arial Narrow"/>
+          <w:b/>
+          <w:bCs/>
+          <w:color w:val="000000"/>
+          <w:kern w:val="0"/>
+          <w:lang w:eastAsia="pt-BR"/>
+          <w14:ligatures w14:val="none"/>
+        </w:rPr>
+        <w:t xml:space="preserve"> </w:t>
+      </w:r>
+      <w:r>
+        <w:rPr>
+          <w:rFonts w:eastAsia="Times New Roman" w:cs="Arial" w:ascii="Arial Narrow" w:hAnsi="Arial Narrow"/>
           <w:b w:val="false"/>
           <w:bCs w:val="false"/>
           <w:color w:val="000000"/>
@@ -1599,6 +1892,30 @@
       <w:r>
         <w:rPr>
           <w:rFonts w:eastAsia="Times New Roman" w:cs="Arial" w:ascii="Arial Narrow" w:hAnsi="Arial Narrow"/>
+          <w:b/>
+          <w:bCs/>
+          <w:color w:val="000000"/>
+          <w:kern w:val="0"/>
+          <w:lang w:eastAsia="pt-BR"/>
+          <w14:ligatures w14:val="none"/>
+        </w:rPr>
+        <w:t>(1,00 pt.)</w:t>
+      </w:r>
+      <w:r>
+        <w:rPr>
+          <w:rFonts w:eastAsia="Times New Roman" w:cs="Arial" w:ascii="Arial Narrow" w:hAnsi="Arial Narrow"/>
+          <w:b/>
+          <w:bCs/>
+          <w:color w:val="000000"/>
+          <w:kern w:val="0"/>
+          <w:lang w:eastAsia="pt-BR"/>
+          <w14:ligatures w14:val="none"/>
+        </w:rPr>
+        <w:t xml:space="preserve"> </w:t>
+      </w:r>
+      <w:r>
+        <w:rPr>
+          <w:rFonts w:eastAsia="Times New Roman" w:cs="Arial" w:ascii="Arial Narrow" w:hAnsi="Arial Narrow"/>
           <w:b w:val="false"/>
           <w:bCs w:val="false"/>
           <w:color w:val="000000"/>
@@ -1654,6 +1971,30 @@
       <w:r>
         <w:rPr>
           <w:rFonts w:eastAsia="Times New Roman" w:cs="Arial" w:ascii="Arial Narrow" w:hAnsi="Arial Narrow"/>
+          <w:b/>
+          <w:bCs/>
+          <w:color w:val="000000"/>
+          <w:kern w:val="0"/>
+          <w:lang w:eastAsia="pt-BR"/>
+          <w14:ligatures w14:val="none"/>
+        </w:rPr>
+        <w:t>(1,00 pt.)</w:t>
+      </w:r>
+      <w:r>
+        <w:rPr>
+          <w:rFonts w:eastAsia="Times New Roman" w:cs="Arial" w:ascii="Arial Narrow" w:hAnsi="Arial Narrow"/>
+          <w:b/>
+          <w:bCs/>
+          <w:color w:val="000000"/>
+          <w:kern w:val="0"/>
+          <w:lang w:eastAsia="pt-BR"/>
+          <w14:ligatures w14:val="none"/>
+        </w:rPr>
+        <w:t xml:space="preserve"> </w:t>
+      </w:r>
+      <w:r>
+        <w:rPr>
+          <w:rFonts w:eastAsia="Times New Roman" w:cs="Arial" w:ascii="Arial Narrow" w:hAnsi="Arial Narrow"/>
           <w:b w:val="false"/>
           <w:bCs w:val="false"/>
           <w:color w:val="000000"/>
@@ -1705,6 +2046,30 @@
           <w14:ligatures w14:val="none"/>
         </w:rPr>
         <w:t xml:space="preserve">11. </w:t>
+      </w:r>
+      <w:r>
+        <w:rPr>
+          <w:rFonts w:eastAsia="Times New Roman" w:cs="Arial" w:ascii="Arial Narrow" w:hAnsi="Arial Narrow"/>
+          <w:b/>
+          <w:bCs/>
+          <w:color w:val="000000"/>
+          <w:kern w:val="0"/>
+          <w:lang w:eastAsia="pt-BR"/>
+          <w14:ligatures w14:val="none"/>
+        </w:rPr>
+        <w:t>(1,00 pt.)</w:t>
+      </w:r>
+      <w:r>
+        <w:rPr>
+          <w:rFonts w:eastAsia="Times New Roman" w:cs="Arial" w:ascii="Arial Narrow" w:hAnsi="Arial Narrow"/>
+          <w:b/>
+          <w:bCs/>
+          <w:color w:val="000000"/>
+          <w:kern w:val="0"/>
+          <w:lang w:eastAsia="pt-BR"/>
+          <w14:ligatures w14:val="none"/>
+        </w:rPr>
+        <w:t xml:space="preserve"> </w:t>
       </w:r>
       <w:r>
         <w:rPr>
@@ -2431,13 +2796,7 @@
         </w:rPr>
       </w:pPr>
       <w:r>
-        <w:rPr>
-          <w:rFonts w:eastAsia="Times New Roman" w:cs="Arial" w:ascii="Arial Narrow" w:hAnsi="Arial Narrow"/>
-          <w:color w:val="000000"/>
-          <w:kern w:val="0"/>
-          <w:lang w:eastAsia="pt-BR"/>
-          <w14:ligatures w14:val="none"/>
-        </w:rPr>
+        <w:rPr/>
       </w:r>
     </w:p>
     <w:p>
@@ -2453,24 +2812,11 @@
         </w:sectPr>
       </w:pPr>
     </w:p>
-    <w:p>
-      <w:pPr>
-        <w:pStyle w:val="Normal"/>
-        <w:widowControl/>
-        <w:suppressAutoHyphens w:val="true"/>
-        <w:bidi w:val="0"/>
-        <w:spacing w:lineRule="auto" w:line="276" w:before="0" w:after="160"/>
-        <w:jc w:val="left"/>
-        <w:rPr/>
-      </w:pPr>
-      <w:r>
-        <w:rPr/>
-      </w:r>
-    </w:p>
     <w:sectPr>
       <w:type w:val="continuous"/>
       <w:pgSz w:w="11906" w:h="16838"/>
       <w:pgMar w:left="737" w:right="737" w:gutter="0" w:header="0" w:top="737" w:footer="708" w:bottom="765"/>
+      <w:pgNumType w:fmt="decimal"/>
       <w:formProt w:val="false"/>
       <w:textDirection w:val="lrTb"/>
       <w:docGrid w:type="default" w:linePitch="360" w:charSpace="0"/>
@@ -2534,7 +2880,7 @@
           <w:rPr>
             <w:rFonts w:cs="Arial" w:ascii="Arial" w:hAnsi="Arial"/>
           </w:rPr>
-          <w:t>2</w:t>
+          <w:t>1</w:t>
         </w:r>
         <w:r>
           <w:rPr>
@@ -2589,7 +2935,7 @@
           <w:rPr>
             <w:rFonts w:cs="Arial" w:ascii="Arial" w:hAnsi="Arial"/>
           </w:rPr>
-          <w:t>2</w:t>
+          <w:t>1</w:t>
         </w:r>
         <w:r>
           <w:rPr>
@@ -3735,6 +4081,13 @@
       <w14:ligatures w14:val="none"/>
     </w:rPr>
   </w:style>
+  <w:style w:type="character" w:styleId="Hyperlink">
+    <w:name w:val="Hyperlink"/>
+    <w:rPr>
+      <w:color w:val="000080"/>
+      <w:u w:val="single"/>
+    </w:rPr>
+  </w:style>
   <w:style w:type="paragraph" w:styleId="Heading">
     <w:name w:val="Heading"/>
     <w:basedOn w:val="Normal"/>

</xml_diff>

<commit_message>
v3.3.0: campos de professor e disciplina, novo Modelo_AF2.docx e símbolo E atualizado
- Adiciona inputs de professor e disciplina na UI (com validação)
- Substitui {{professor aqui}} e {{disciplina aqui}} nos templates
- Adiciona Modelo_AF2.docx com 20 questões objetivas (0,25 pt cada)
- Atualiza referência de Modelo_AF.docx para Modelo_AF2.docx
- Troca símbolo da versão E de '[]' para '++'

Co-Authored-By: Claude Sonnet 4.6 <noreply@anthropic.com>
</commit_message>
<xml_diff>
--- a/Modelo_AR2.docx
+++ b/Modelo_AR2.docx
@@ -219,14 +219,14 @@
       <w:r>
         <w:rPr>
           <w:rFonts w:eastAsia="Times New Roman" w:cs="Times New Roman" w:ascii="Arial Narrow" w:hAnsi="Arial Narrow"/>
-          <w:color w:val="FF0000"/>
+          <w:color w:val="000000"/>
           <w:kern w:val="0"/>
           <w:sz w:val="20"/>
           <w:szCs w:val="20"/>
           <w:lang w:val="pt-PT" w:eastAsia="pt-BR"/>
           <w14:ligatures w14:val="none"/>
         </w:rPr>
-        <w:t>xxxxxxxxxxxxxxxx</w:t>
+        <w:t>{{professor aqui}}</w:t>
       </w:r>
     </w:p>
     <w:p>
@@ -241,7 +241,12 @@
         <w:ind w:left="5670"/>
         <w:jc w:val="right"/>
         <w:rPr>
-          <w:rFonts w:ascii="Arial Narrow" w:hAnsi="Arial Narrow" w:eastAsia="Times New Roman" w:cs="Times New Roman"/>
+          <w:color w:val="000000"/>
+        </w:rPr>
+      </w:pPr>
+      <w:r>
+        <w:rPr>
+          <w:rFonts w:eastAsia="Times New Roman" w:cs="Times New Roman" w:ascii="Arial Narrow" w:hAnsi="Arial Narrow"/>
           <w:color w:val="000000"/>
           <w:kern w:val="0"/>
           <w:sz w:val="20"/>
@@ -249,18 +254,20 @@
           <w:lang w:val="pt-PT" w:eastAsia="pt-BR"/>
           <w14:ligatures w14:val="none"/>
         </w:rPr>
-      </w:pPr>
+        <w:t>Disciplina:</w:t>
+      </w:r>
       <w:r>
         <w:rPr>
           <w:rFonts w:eastAsia="Times New Roman" w:cs="Times New Roman" w:ascii="Arial Narrow" w:hAnsi="Arial Narrow"/>
           <w:color w:val="000000"/>
+          <w:spacing w:val="-6"/>
           <w:kern w:val="0"/>
           <w:sz w:val="20"/>
           <w:szCs w:val="20"/>
           <w:lang w:val="pt-PT" w:eastAsia="pt-BR"/>
           <w14:ligatures w14:val="none"/>
         </w:rPr>
-        <w:t>Disciplina:</w:t>
+        <w:t xml:space="preserve"> </w:t>
       </w:r>
       <w:r>
         <w:rPr>
@@ -273,19 +280,7 @@
           <w:lang w:val="pt-PT" w:eastAsia="pt-BR"/>
           <w14:ligatures w14:val="none"/>
         </w:rPr>
-        <w:t xml:space="preserve"> </w:t>
-      </w:r>
-      <w:r>
-        <w:rPr>
-          <w:rFonts w:eastAsia="Times New Roman" w:cs="Times New Roman" w:ascii="Arial Narrow" w:hAnsi="Arial Narrow"/>
-          <w:color w:val="FF0000"/>
-          <w:kern w:val="0"/>
-          <w:sz w:val="20"/>
-          <w:szCs w:val="20"/>
-          <w:lang w:val="pt-PT" w:eastAsia="pt-BR"/>
-          <w14:ligatures w14:val="none"/>
-        </w:rPr>
-        <w:t>xxxxxxxxxxxxxxxxxx</w:t>
+        <w:t>{{disciplina aqui}}</w:t>
       </w:r>
     </w:p>
     <w:p>
@@ -402,7 +397,7 @@
         <mc:AlternateContent>
           <mc:Choice Requires="wps">
             <w:drawing>
-              <wp:anchor behindDoc="0" distT="0" distB="0" distL="0" distR="0" simplePos="0" locked="0" layoutInCell="1" allowOverlap="1" relativeHeight="4">
+              <wp:anchor behindDoc="0" distT="1270" distB="635" distL="635" distR="1270" simplePos="0" locked="0" layoutInCell="1" allowOverlap="1" relativeHeight="4">
                 <wp:simplePos x="0" y="0"/>
                 <wp:positionH relativeFrom="column">
                   <wp:posOffset>5541010</wp:posOffset>
@@ -451,13 +446,7 @@
             </w:drawing>
           </mc:Choice>
           <mc:Fallback>
-            <w:pict>
-              <v:roundrect id="shape_0" ID="Shape 1" fillcolor="#b2b2b2" stroked="t" o:allowincell="f" style="position:absolute;margin-left:436.3pt;margin-top:21.95pt;width:88.45pt;height:24.7pt;mso-wrap-style:none;v-text-anchor:middle">
-                <v:fill o:detectmouseclick="t" color2="#4d4d4d"/>
-                <v:stroke color="#3465a4" joinstyle="round" endcap="flat"/>
-                <w10:wrap type="none"/>
-              </v:roundrect>
-            </w:pict>
+            <w:pict/>
           </mc:Fallback>
         </mc:AlternateContent>
       </w:r>
@@ -556,27 +545,7 @@
                 <w:szCs w:val="28"/>
                 <w:lang w:eastAsia="en-US" w:bidi="ar-SA"/>
               </w:rPr>
-              <w:t>CURSO: __________</w:t>
-            </w:r>
-            <w:r>
-              <w:rPr>
-                <w:rFonts w:ascii="Arial Narrow" w:hAnsi="Arial Narrow"/>
-                <w:color w:themeColor="text1" w:val="000000"/>
-                <w:sz w:val="24"/>
-                <w:szCs w:val="28"/>
-                <w:lang w:eastAsia="en-US" w:bidi="ar-SA"/>
-              </w:rPr>
-              <w:t>_</w:t>
-            </w:r>
-            <w:r>
-              <w:rPr>
-                <w:rFonts w:ascii="Arial Narrow" w:hAnsi="Arial Narrow"/>
-                <w:color w:themeColor="text1" w:val="000000"/>
-                <w:sz w:val="24"/>
-                <w:szCs w:val="28"/>
-                <w:lang w:eastAsia="en-US" w:bidi="ar-SA"/>
-              </w:rPr>
-              <w:t>______________</w:t>
+              <w:t>CURSO: _________________________</w:t>
             </w:r>
           </w:p>
         </w:tc>
@@ -610,27 +579,7 @@
                 <w:szCs w:val="28"/>
                 <w:lang w:eastAsia="en-US" w:bidi="ar-SA"/>
               </w:rPr>
-              <w:t xml:space="preserve">SÉRIE:____PERÍODO:___DATA:____/____/_____ </w:t>
-            </w:r>
-            <w:r>
-              <w:rPr>
-                <w:rFonts w:ascii="Arial Narrow" w:hAnsi="Arial Narrow"/>
-                <w:color w:themeColor="text1" w:val="000000"/>
-                <w:sz w:val="24"/>
-                <w:szCs w:val="28"/>
-                <w:lang w:eastAsia="en-US" w:bidi="ar-SA"/>
-              </w:rPr>
-              <w:t>NO</w:t>
-            </w:r>
-            <w:r>
-              <w:rPr>
-                <w:rFonts w:ascii="Arial Narrow" w:hAnsi="Arial Narrow"/>
-                <w:color w:themeColor="text1" w:val="000000"/>
-                <w:sz w:val="24"/>
-                <w:szCs w:val="28"/>
-                <w:lang w:eastAsia="en-US" w:bidi="ar-SA"/>
-              </w:rPr>
-              <w:t xml:space="preserve">TA: </w:t>
+              <w:t>SÉRIE:____PERÍODO:___DATA:____/____/_____ NOTA:</w:t>
             </w:r>
           </w:p>
         </w:tc>
@@ -1274,31 +1223,7 @@
           <w:lang w:eastAsia="pt-BR"/>
           <w14:ligatures w14:val="none"/>
         </w:rPr>
-        <w:t xml:space="preserve">1. </w:t>
-      </w:r>
-      <w:r>
-        <w:rPr>
-          <w:rFonts w:eastAsia="Times New Roman" w:cs="Arial" w:ascii="Arial Narrow" w:hAnsi="Arial Narrow"/>
-          <w:b/>
-          <w:bCs/>
-          <w:color w:val="000000"/>
-          <w:kern w:val="0"/>
-          <w:lang w:eastAsia="pt-BR"/>
-          <w14:ligatures w14:val="none"/>
-        </w:rPr>
-        <w:t>(0,25 pt.)</w:t>
-      </w:r>
-      <w:r>
-        <w:rPr>
-          <w:rFonts w:eastAsia="Times New Roman" w:cs="Arial" w:ascii="Arial Narrow" w:hAnsi="Arial Narrow"/>
-          <w:b/>
-          <w:bCs/>
-          <w:color w:val="000000"/>
-          <w:kern w:val="0"/>
-          <w:lang w:eastAsia="pt-BR"/>
-          <w14:ligatures w14:val="none"/>
-        </w:rPr>
-        <w:t xml:space="preserve"> </w:t>
+        <w:t xml:space="preserve">1. (0,25 pt.) </w:t>
       </w:r>
       <w:r>
         <w:rPr>
@@ -1353,31 +1278,7 @@
           <w:lang w:eastAsia="pt-BR"/>
           <w14:ligatures w14:val="none"/>
         </w:rPr>
-        <w:t xml:space="preserve">2. </w:t>
-      </w:r>
-      <w:r>
-        <w:rPr>
-          <w:rFonts w:eastAsia="Times New Roman" w:cs="Arial" w:ascii="Arial Narrow" w:hAnsi="Arial Narrow"/>
-          <w:b/>
-          <w:bCs/>
-          <w:color w:val="000000"/>
-          <w:kern w:val="0"/>
-          <w:lang w:eastAsia="pt-BR"/>
-          <w14:ligatures w14:val="none"/>
-        </w:rPr>
-        <w:t>(0,25 pt.)</w:t>
-      </w:r>
-      <w:r>
-        <w:rPr>
-          <w:rFonts w:eastAsia="Times New Roman" w:cs="Arial" w:ascii="Arial Narrow" w:hAnsi="Arial Narrow"/>
-          <w:b/>
-          <w:bCs/>
-          <w:color w:val="000000"/>
-          <w:kern w:val="0"/>
-          <w:lang w:eastAsia="pt-BR"/>
-          <w14:ligatures w14:val="none"/>
-        </w:rPr>
-        <w:t xml:space="preserve">  </w:t>
+        <w:t xml:space="preserve">2. (0,25 pt.)  </w:t>
       </w:r>
       <w:r>
         <w:rPr>
@@ -1436,31 +1337,7 @@
           <w:lang w:eastAsia="pt-BR"/>
           <w14:ligatures w14:val="none"/>
         </w:rPr>
-        <w:t xml:space="preserve">3. </w:t>
-      </w:r>
-      <w:r>
-        <w:rPr>
-          <w:rFonts w:eastAsia="Times New Roman" w:cs="Arial" w:ascii="Arial Narrow" w:hAnsi="Arial Narrow"/>
-          <w:b/>
-          <w:bCs/>
-          <w:color w:val="000000"/>
-          <w:kern w:val="0"/>
-          <w:lang w:eastAsia="pt-BR"/>
-          <w14:ligatures w14:val="none"/>
-        </w:rPr>
-        <w:t>(0,25 pt.)</w:t>
-      </w:r>
-      <w:r>
-        <w:rPr>
-          <w:rFonts w:eastAsia="Times New Roman" w:cs="Arial" w:ascii="Arial Narrow" w:hAnsi="Arial Narrow"/>
-          <w:b/>
-          <w:bCs/>
-          <w:color w:val="000000"/>
-          <w:kern w:val="0"/>
-          <w:lang w:eastAsia="pt-BR"/>
-          <w14:ligatures w14:val="none"/>
-        </w:rPr>
-        <w:t xml:space="preserve"> </w:t>
+        <w:t xml:space="preserve">3. (0,25 pt.) </w:t>
       </w:r>
       <w:r>
         <w:rPr>
@@ -1515,31 +1392,7 @@
           <w:lang w:eastAsia="pt-BR"/>
           <w14:ligatures w14:val="none"/>
         </w:rPr>
-        <w:t xml:space="preserve">4. </w:t>
-      </w:r>
-      <w:r>
-        <w:rPr>
-          <w:rFonts w:eastAsia="Times New Roman" w:cs="Arial" w:ascii="Arial Narrow" w:hAnsi="Arial Narrow"/>
-          <w:b/>
-          <w:bCs/>
-          <w:color w:val="000000"/>
-          <w:kern w:val="0"/>
-          <w:lang w:eastAsia="pt-BR"/>
-          <w14:ligatures w14:val="none"/>
-        </w:rPr>
-        <w:t>(0,25 pt.)</w:t>
-      </w:r>
-      <w:r>
-        <w:rPr>
-          <w:rFonts w:eastAsia="Times New Roman" w:cs="Arial" w:ascii="Arial Narrow" w:hAnsi="Arial Narrow"/>
-          <w:b/>
-          <w:bCs/>
-          <w:color w:val="000000"/>
-          <w:kern w:val="0"/>
-          <w:lang w:eastAsia="pt-BR"/>
-          <w14:ligatures w14:val="none"/>
-        </w:rPr>
-        <w:t xml:space="preserve"> </w:t>
+        <w:t xml:space="preserve">4. (0,25 pt.) </w:t>
       </w:r>
       <w:r>
         <w:rPr>
@@ -1594,31 +1447,7 @@
           <w:lang w:eastAsia="pt-BR"/>
           <w14:ligatures w14:val="none"/>
         </w:rPr>
-        <w:t xml:space="preserve">5. </w:t>
-      </w:r>
-      <w:r>
-        <w:rPr>
-          <w:rFonts w:eastAsia="Times New Roman" w:cs="Arial" w:ascii="Arial Narrow" w:hAnsi="Arial Narrow"/>
-          <w:b/>
-          <w:bCs/>
-          <w:color w:val="000000"/>
-          <w:kern w:val="0"/>
-          <w:lang w:eastAsia="pt-BR"/>
-          <w14:ligatures w14:val="none"/>
-        </w:rPr>
-        <w:t>(0,25 pt.)</w:t>
-      </w:r>
-      <w:r>
-        <w:rPr>
-          <w:rFonts w:eastAsia="Times New Roman" w:cs="Arial" w:ascii="Arial Narrow" w:hAnsi="Arial Narrow"/>
-          <w:b/>
-          <w:bCs/>
-          <w:color w:val="000000"/>
-          <w:kern w:val="0"/>
-          <w:lang w:eastAsia="pt-BR"/>
-          <w14:ligatures w14:val="none"/>
-        </w:rPr>
-        <w:t xml:space="preserve"> </w:t>
+        <w:t xml:space="preserve">5. (0,25 pt.) </w:t>
       </w:r>
       <w:r>
         <w:rPr>
@@ -1673,31 +1502,7 @@
           <w:lang w:eastAsia="pt-BR"/>
           <w14:ligatures w14:val="none"/>
         </w:rPr>
-        <w:t xml:space="preserve">6. </w:t>
-      </w:r>
-      <w:r>
-        <w:rPr>
-          <w:rFonts w:eastAsia="Times New Roman" w:cs="Arial" w:ascii="Arial Narrow" w:hAnsi="Arial Narrow"/>
-          <w:b/>
-          <w:bCs/>
-          <w:color w:val="000000"/>
-          <w:kern w:val="0"/>
-          <w:lang w:eastAsia="pt-BR"/>
-          <w14:ligatures w14:val="none"/>
-        </w:rPr>
-        <w:t>(0,25 pt.)</w:t>
-      </w:r>
-      <w:r>
-        <w:rPr>
-          <w:rFonts w:eastAsia="Times New Roman" w:cs="Arial" w:ascii="Arial Narrow" w:hAnsi="Arial Narrow"/>
-          <w:b/>
-          <w:bCs/>
-          <w:color w:val="000000"/>
-          <w:kern w:val="0"/>
-          <w:lang w:eastAsia="pt-BR"/>
-          <w14:ligatures w14:val="none"/>
-        </w:rPr>
-        <w:t xml:space="preserve"> </w:t>
+        <w:t xml:space="preserve">6. (0,25 pt.) </w:t>
       </w:r>
       <w:r>
         <w:rPr>
@@ -1752,31 +1557,7 @@
           <w:lang w:eastAsia="pt-BR"/>
           <w14:ligatures w14:val="none"/>
         </w:rPr>
-        <w:t xml:space="preserve">7. </w:t>
-      </w:r>
-      <w:r>
-        <w:rPr>
-          <w:rFonts w:eastAsia="Times New Roman" w:cs="Arial" w:ascii="Arial Narrow" w:hAnsi="Arial Narrow"/>
-          <w:b/>
-          <w:bCs/>
-          <w:color w:val="000000"/>
-          <w:kern w:val="0"/>
-          <w:lang w:eastAsia="pt-BR"/>
-          <w14:ligatures w14:val="none"/>
-        </w:rPr>
-        <w:t>(0,25 pt.)</w:t>
-      </w:r>
-      <w:r>
-        <w:rPr>
-          <w:rFonts w:eastAsia="Times New Roman" w:cs="Arial" w:ascii="Arial Narrow" w:hAnsi="Arial Narrow"/>
-          <w:b/>
-          <w:bCs/>
-          <w:color w:val="000000"/>
-          <w:kern w:val="0"/>
-          <w:lang w:eastAsia="pt-BR"/>
-          <w14:ligatures w14:val="none"/>
-        </w:rPr>
-        <w:t xml:space="preserve"> </w:t>
+        <w:t xml:space="preserve">7. (0,25 pt.) </w:t>
       </w:r>
       <w:r>
         <w:rPr>
@@ -1789,6 +1570,25 @@
           <w14:ligatures w14:val="none"/>
         </w:rPr>
         <w:t>{{Questão 7 aqui}}</w:t>
+      </w:r>
+    </w:p>
+    <w:p>
+      <w:pPr>
+        <w:pStyle w:val="Normal"/>
+        <w:spacing w:lineRule="auto" w:line="240" w:before="0" w:after="0"/>
+        <w:jc w:val="left"/>
+        <w:rPr>
+          <w:rFonts w:ascii="Arial Narrow" w:hAnsi="Arial Narrow" w:eastAsia="Times New Roman" w:cs="Arial"/>
+          <w:b/>
+          <w:bCs/>
+          <w:color w:val="000000"/>
+          <w:kern w:val="0"/>
+          <w:lang w:eastAsia="pt-BR"/>
+          <w14:ligatures w14:val="none"/>
+        </w:rPr>
+      </w:pPr>
+      <w:r>
+        <w:rPr/>
       </w:r>
     </w:p>
     <w:p>
@@ -1808,31 +1608,7 @@
           <w:lang w:eastAsia="pt-BR"/>
           <w14:ligatures w14:val="none"/>
         </w:rPr>
-        <w:t xml:space="preserve">8. </w:t>
-      </w:r>
-      <w:r>
-        <w:rPr>
-          <w:rFonts w:eastAsia="Times New Roman" w:cs="Arial" w:ascii="Arial Narrow" w:hAnsi="Arial Narrow"/>
-          <w:b/>
-          <w:bCs/>
-          <w:color w:val="000000"/>
-          <w:kern w:val="0"/>
-          <w:lang w:eastAsia="pt-BR"/>
-          <w14:ligatures w14:val="none"/>
-        </w:rPr>
-        <w:t>(0,25 pt.)</w:t>
-      </w:r>
-      <w:r>
-        <w:rPr>
-          <w:rFonts w:eastAsia="Times New Roman" w:cs="Arial" w:ascii="Arial Narrow" w:hAnsi="Arial Narrow"/>
-          <w:b/>
-          <w:bCs/>
-          <w:color w:val="000000"/>
-          <w:kern w:val="0"/>
-          <w:lang w:eastAsia="pt-BR"/>
-          <w14:ligatures w14:val="none"/>
-        </w:rPr>
-        <w:t xml:space="preserve"> </w:t>
+        <w:t xml:space="preserve">8. (0,25 pt.) </w:t>
       </w:r>
       <w:r>
         <w:rPr>
@@ -1887,31 +1663,7 @@
           <w:lang w:eastAsia="pt-BR"/>
           <w14:ligatures w14:val="none"/>
         </w:rPr>
-        <w:t xml:space="preserve">9. </w:t>
-      </w:r>
-      <w:r>
-        <w:rPr>
-          <w:rFonts w:eastAsia="Times New Roman" w:cs="Arial" w:ascii="Arial Narrow" w:hAnsi="Arial Narrow"/>
-          <w:b/>
-          <w:bCs/>
-          <w:color w:val="000000"/>
-          <w:kern w:val="0"/>
-          <w:lang w:eastAsia="pt-BR"/>
-          <w14:ligatures w14:val="none"/>
-        </w:rPr>
-        <w:t>(1,00 pt.)</w:t>
-      </w:r>
-      <w:r>
-        <w:rPr>
-          <w:rFonts w:eastAsia="Times New Roman" w:cs="Arial" w:ascii="Arial Narrow" w:hAnsi="Arial Narrow"/>
-          <w:b/>
-          <w:bCs/>
-          <w:color w:val="000000"/>
-          <w:kern w:val="0"/>
-          <w:lang w:eastAsia="pt-BR"/>
-          <w14:ligatures w14:val="none"/>
-        </w:rPr>
-        <w:t xml:space="preserve"> </w:t>
+        <w:t xml:space="preserve">9. (1,00 pt.) </w:t>
       </w:r>
       <w:r>
         <w:rPr>
@@ -1966,31 +1718,7 @@
           <w:lang w:eastAsia="pt-BR"/>
           <w14:ligatures w14:val="none"/>
         </w:rPr>
-        <w:t xml:space="preserve">10. </w:t>
-      </w:r>
-      <w:r>
-        <w:rPr>
-          <w:rFonts w:eastAsia="Times New Roman" w:cs="Arial" w:ascii="Arial Narrow" w:hAnsi="Arial Narrow"/>
-          <w:b/>
-          <w:bCs/>
-          <w:color w:val="000000"/>
-          <w:kern w:val="0"/>
-          <w:lang w:eastAsia="pt-BR"/>
-          <w14:ligatures w14:val="none"/>
-        </w:rPr>
-        <w:t>(1,00 pt.)</w:t>
-      </w:r>
-      <w:r>
-        <w:rPr>
-          <w:rFonts w:eastAsia="Times New Roman" w:cs="Arial" w:ascii="Arial Narrow" w:hAnsi="Arial Narrow"/>
-          <w:b/>
-          <w:bCs/>
-          <w:color w:val="000000"/>
-          <w:kern w:val="0"/>
-          <w:lang w:eastAsia="pt-BR"/>
-          <w14:ligatures w14:val="none"/>
-        </w:rPr>
-        <w:t xml:space="preserve"> </w:t>
+        <w:t xml:space="preserve">10. (1,00 pt.) </w:t>
       </w:r>
       <w:r>
         <w:rPr>
@@ -2045,31 +1773,7 @@
           <w:lang w:eastAsia="pt-BR"/>
           <w14:ligatures w14:val="none"/>
         </w:rPr>
-        <w:t xml:space="preserve">11. </w:t>
-      </w:r>
-      <w:r>
-        <w:rPr>
-          <w:rFonts w:eastAsia="Times New Roman" w:cs="Arial" w:ascii="Arial Narrow" w:hAnsi="Arial Narrow"/>
-          <w:b/>
-          <w:bCs/>
-          <w:color w:val="000000"/>
-          <w:kern w:val="0"/>
-          <w:lang w:eastAsia="pt-BR"/>
-          <w14:ligatures w14:val="none"/>
-        </w:rPr>
-        <w:t>(1,00 pt.)</w:t>
-      </w:r>
-      <w:r>
-        <w:rPr>
-          <w:rFonts w:eastAsia="Times New Roman" w:cs="Arial" w:ascii="Arial Narrow" w:hAnsi="Arial Narrow"/>
-          <w:b/>
-          <w:bCs/>
-          <w:color w:val="000000"/>
-          <w:kern w:val="0"/>
-          <w:lang w:eastAsia="pt-BR"/>
-          <w14:ligatures w14:val="none"/>
-        </w:rPr>
-        <w:t xml:space="preserve"> </w:t>
+        <w:t xml:space="preserve">11. (1,00 pt.) </w:t>
       </w:r>
       <w:r>
         <w:rPr>
@@ -2082,721 +1786,6 @@
           <w14:ligatures w14:val="none"/>
         </w:rPr>
         <w:t>{{Questão 11 aqui}}</w:t>
-      </w:r>
-    </w:p>
-    <w:p>
-      <w:pPr>
-        <w:pStyle w:val="Normal"/>
-        <w:spacing w:lineRule="auto" w:line="240" w:before="0" w:after="0"/>
-        <w:ind w:left="360"/>
-        <w:contextualSpacing/>
-        <w:jc w:val="left"/>
-        <w:rPr>
-          <w:rFonts w:ascii="Arial Narrow" w:hAnsi="Arial Narrow" w:eastAsia="Times New Roman" w:cs="Arial"/>
-          <w:color w:val="000000"/>
-          <w:kern w:val="0"/>
-          <w:lang w:eastAsia="pt-BR"/>
-          <w14:ligatures w14:val="none"/>
-        </w:rPr>
-      </w:pPr>
-      <w:r>
-        <w:rPr>
-          <w:rFonts w:eastAsia="Times New Roman" w:cs="Arial" w:ascii="Arial Narrow" w:hAnsi="Arial Narrow"/>
-          <w:color w:val="000000"/>
-          <w:kern w:val="0"/>
-          <w:lang w:eastAsia="pt-BR"/>
-          <w14:ligatures w14:val="none"/>
-        </w:rPr>
-      </w:r>
-    </w:p>
-    <w:p>
-      <w:pPr>
-        <w:pStyle w:val="Normal"/>
-        <w:spacing w:lineRule="auto" w:line="240" w:before="0" w:after="0"/>
-        <w:contextualSpacing/>
-        <w:jc w:val="both"/>
-        <w:rPr>
-          <w:rFonts w:ascii="Arial Narrow" w:hAnsi="Arial Narrow" w:eastAsia="Times New Roman" w:cs="Arial"/>
-          <w:color w:val="000000"/>
-          <w:kern w:val="0"/>
-          <w:lang w:eastAsia="pt-BR"/>
-          <w14:ligatures w14:val="none"/>
-        </w:rPr>
-      </w:pPr>
-      <w:r>
-        <w:rPr>
-          <w:rFonts w:eastAsia="Times New Roman" w:cs="Arial" w:ascii="Arial Narrow" w:hAnsi="Arial Narrow"/>
-          <w:color w:val="000000"/>
-          <w:kern w:val="0"/>
-          <w:lang w:eastAsia="pt-BR"/>
-          <w14:ligatures w14:val="none"/>
-        </w:rPr>
-      </w:r>
-    </w:p>
-    <w:p>
-      <w:pPr>
-        <w:pStyle w:val="Normal"/>
-        <w:spacing w:lineRule="auto" w:line="240" w:before="0" w:after="0"/>
-        <w:contextualSpacing/>
-        <w:jc w:val="both"/>
-        <w:rPr>
-          <w:rFonts w:ascii="Arial Narrow" w:hAnsi="Arial Narrow" w:eastAsia="Times New Roman" w:cs="Arial"/>
-          <w:color w:val="000000"/>
-          <w:kern w:val="0"/>
-          <w:lang w:eastAsia="pt-BR"/>
-          <w14:ligatures w14:val="none"/>
-        </w:rPr>
-      </w:pPr>
-      <w:r>
-        <w:rPr>
-          <w:rFonts w:eastAsia="Times New Roman" w:cs="Arial" w:ascii="Arial Narrow" w:hAnsi="Arial Narrow"/>
-          <w:color w:val="000000"/>
-          <w:kern w:val="0"/>
-          <w:lang w:eastAsia="pt-BR"/>
-          <w14:ligatures w14:val="none"/>
-        </w:rPr>
-      </w:r>
-    </w:p>
-    <w:p>
-      <w:pPr>
-        <w:pStyle w:val="Normal"/>
-        <w:spacing w:lineRule="auto" w:line="240" w:before="0" w:after="0"/>
-        <w:contextualSpacing/>
-        <w:jc w:val="both"/>
-        <w:rPr>
-          <w:rFonts w:ascii="Arial Narrow" w:hAnsi="Arial Narrow" w:eastAsia="Times New Roman" w:cs="Arial"/>
-          <w:color w:val="000000"/>
-          <w:kern w:val="0"/>
-          <w:lang w:eastAsia="pt-BR"/>
-          <w14:ligatures w14:val="none"/>
-        </w:rPr>
-      </w:pPr>
-      <w:r>
-        <w:rPr>
-          <w:rFonts w:eastAsia="Times New Roman" w:cs="Arial" w:ascii="Arial Narrow" w:hAnsi="Arial Narrow"/>
-          <w:color w:val="000000"/>
-          <w:kern w:val="0"/>
-          <w:lang w:eastAsia="pt-BR"/>
-          <w14:ligatures w14:val="none"/>
-        </w:rPr>
-      </w:r>
-    </w:p>
-    <w:p>
-      <w:pPr>
-        <w:pStyle w:val="Normal"/>
-        <w:spacing w:lineRule="auto" w:line="240" w:before="0" w:after="0"/>
-        <w:contextualSpacing/>
-        <w:jc w:val="both"/>
-        <w:rPr>
-          <w:rFonts w:ascii="Arial Narrow" w:hAnsi="Arial Narrow" w:eastAsia="Times New Roman" w:cs="Arial"/>
-          <w:color w:val="000000"/>
-          <w:kern w:val="0"/>
-          <w:lang w:eastAsia="pt-BR"/>
-          <w14:ligatures w14:val="none"/>
-        </w:rPr>
-      </w:pPr>
-      <w:r>
-        <w:rPr>
-          <w:rFonts w:eastAsia="Times New Roman" w:cs="Arial" w:ascii="Arial Narrow" w:hAnsi="Arial Narrow"/>
-          <w:color w:val="000000"/>
-          <w:kern w:val="0"/>
-          <w:lang w:eastAsia="pt-BR"/>
-          <w14:ligatures w14:val="none"/>
-        </w:rPr>
-      </w:r>
-    </w:p>
-    <w:p>
-      <w:pPr>
-        <w:pStyle w:val="Normal"/>
-        <w:spacing w:lineRule="auto" w:line="240" w:before="0" w:after="0"/>
-        <w:contextualSpacing/>
-        <w:jc w:val="both"/>
-        <w:rPr>
-          <w:rFonts w:ascii="Arial Narrow" w:hAnsi="Arial Narrow" w:eastAsia="Times New Roman" w:cs="Arial"/>
-          <w:color w:val="000000"/>
-          <w:kern w:val="0"/>
-          <w:lang w:eastAsia="pt-BR"/>
-          <w14:ligatures w14:val="none"/>
-        </w:rPr>
-      </w:pPr>
-      <w:r>
-        <w:rPr>
-          <w:rFonts w:eastAsia="Times New Roman" w:cs="Arial" w:ascii="Arial Narrow" w:hAnsi="Arial Narrow"/>
-          <w:color w:val="000000"/>
-          <w:kern w:val="0"/>
-          <w:lang w:eastAsia="pt-BR"/>
-          <w14:ligatures w14:val="none"/>
-        </w:rPr>
-      </w:r>
-    </w:p>
-    <w:p>
-      <w:pPr>
-        <w:pStyle w:val="Normal"/>
-        <w:spacing w:lineRule="auto" w:line="240" w:before="0" w:after="0"/>
-        <w:contextualSpacing/>
-        <w:jc w:val="both"/>
-        <w:rPr>
-          <w:rFonts w:ascii="Arial Narrow" w:hAnsi="Arial Narrow" w:eastAsia="Times New Roman" w:cs="Arial"/>
-          <w:color w:val="000000"/>
-          <w:kern w:val="0"/>
-          <w:lang w:eastAsia="pt-BR"/>
-          <w14:ligatures w14:val="none"/>
-        </w:rPr>
-      </w:pPr>
-      <w:r>
-        <w:rPr>
-          <w:rFonts w:eastAsia="Times New Roman" w:cs="Arial" w:ascii="Arial Narrow" w:hAnsi="Arial Narrow"/>
-          <w:color w:val="000000"/>
-          <w:kern w:val="0"/>
-          <w:lang w:eastAsia="pt-BR"/>
-          <w14:ligatures w14:val="none"/>
-        </w:rPr>
-      </w:r>
-    </w:p>
-    <w:p>
-      <w:pPr>
-        <w:pStyle w:val="Normal"/>
-        <w:spacing w:lineRule="auto" w:line="240" w:before="0" w:after="0"/>
-        <w:contextualSpacing/>
-        <w:jc w:val="both"/>
-        <w:rPr>
-          <w:rFonts w:ascii="Arial Narrow" w:hAnsi="Arial Narrow" w:eastAsia="Times New Roman" w:cs="Arial"/>
-          <w:color w:val="000000"/>
-          <w:kern w:val="0"/>
-          <w:lang w:eastAsia="pt-BR"/>
-          <w14:ligatures w14:val="none"/>
-        </w:rPr>
-      </w:pPr>
-      <w:r>
-        <w:rPr>
-          <w:rFonts w:eastAsia="Times New Roman" w:cs="Arial" w:ascii="Arial Narrow" w:hAnsi="Arial Narrow"/>
-          <w:color w:val="000000"/>
-          <w:kern w:val="0"/>
-          <w:lang w:eastAsia="pt-BR"/>
-          <w14:ligatures w14:val="none"/>
-        </w:rPr>
-      </w:r>
-    </w:p>
-    <w:p>
-      <w:pPr>
-        <w:pStyle w:val="Normal"/>
-        <w:spacing w:lineRule="auto" w:line="240" w:before="0" w:after="0"/>
-        <w:contextualSpacing/>
-        <w:jc w:val="both"/>
-        <w:rPr>
-          <w:rFonts w:ascii="Arial Narrow" w:hAnsi="Arial Narrow" w:eastAsia="Times New Roman" w:cs="Arial"/>
-          <w:color w:val="000000"/>
-          <w:kern w:val="0"/>
-          <w:lang w:eastAsia="pt-BR"/>
-          <w14:ligatures w14:val="none"/>
-        </w:rPr>
-      </w:pPr>
-      <w:r>
-        <w:rPr>
-          <w:rFonts w:eastAsia="Times New Roman" w:cs="Arial" w:ascii="Arial Narrow" w:hAnsi="Arial Narrow"/>
-          <w:color w:val="000000"/>
-          <w:kern w:val="0"/>
-          <w:lang w:eastAsia="pt-BR"/>
-          <w14:ligatures w14:val="none"/>
-        </w:rPr>
-      </w:r>
-    </w:p>
-    <w:p>
-      <w:pPr>
-        <w:pStyle w:val="Normal"/>
-        <w:spacing w:lineRule="auto" w:line="240" w:before="0" w:after="0"/>
-        <w:contextualSpacing/>
-        <w:jc w:val="both"/>
-        <w:rPr>
-          <w:rFonts w:ascii="Arial Narrow" w:hAnsi="Arial Narrow" w:eastAsia="Times New Roman" w:cs="Arial"/>
-          <w:color w:val="000000"/>
-          <w:kern w:val="0"/>
-          <w:lang w:eastAsia="pt-BR"/>
-          <w14:ligatures w14:val="none"/>
-        </w:rPr>
-      </w:pPr>
-      <w:r>
-        <w:rPr>
-          <w:rFonts w:eastAsia="Times New Roman" w:cs="Arial" w:ascii="Arial Narrow" w:hAnsi="Arial Narrow"/>
-          <w:color w:val="000000"/>
-          <w:kern w:val="0"/>
-          <w:lang w:eastAsia="pt-BR"/>
-          <w14:ligatures w14:val="none"/>
-        </w:rPr>
-      </w:r>
-    </w:p>
-    <w:p>
-      <w:pPr>
-        <w:pStyle w:val="Normal"/>
-        <w:spacing w:lineRule="auto" w:line="240" w:before="0" w:after="0"/>
-        <w:contextualSpacing/>
-        <w:jc w:val="both"/>
-        <w:rPr>
-          <w:rFonts w:ascii="Arial Narrow" w:hAnsi="Arial Narrow" w:eastAsia="Times New Roman" w:cs="Arial"/>
-          <w:color w:val="000000"/>
-          <w:kern w:val="0"/>
-          <w:lang w:eastAsia="pt-BR"/>
-          <w14:ligatures w14:val="none"/>
-        </w:rPr>
-      </w:pPr>
-      <w:r>
-        <w:rPr>
-          <w:rFonts w:eastAsia="Times New Roman" w:cs="Arial" w:ascii="Arial Narrow" w:hAnsi="Arial Narrow"/>
-          <w:color w:val="000000"/>
-          <w:kern w:val="0"/>
-          <w:lang w:eastAsia="pt-BR"/>
-          <w14:ligatures w14:val="none"/>
-        </w:rPr>
-      </w:r>
-    </w:p>
-    <w:p>
-      <w:pPr>
-        <w:pStyle w:val="Normal"/>
-        <w:spacing w:lineRule="auto" w:line="240" w:before="0" w:after="0"/>
-        <w:contextualSpacing/>
-        <w:jc w:val="both"/>
-        <w:rPr>
-          <w:rFonts w:ascii="Arial Narrow" w:hAnsi="Arial Narrow" w:eastAsia="Times New Roman" w:cs="Arial"/>
-          <w:color w:val="000000"/>
-          <w:kern w:val="0"/>
-          <w:lang w:eastAsia="pt-BR"/>
-          <w14:ligatures w14:val="none"/>
-        </w:rPr>
-      </w:pPr>
-      <w:r>
-        <w:rPr>
-          <w:rFonts w:eastAsia="Times New Roman" w:cs="Arial" w:ascii="Arial Narrow" w:hAnsi="Arial Narrow"/>
-          <w:color w:val="000000"/>
-          <w:kern w:val="0"/>
-          <w:lang w:eastAsia="pt-BR"/>
-          <w14:ligatures w14:val="none"/>
-        </w:rPr>
-      </w:r>
-    </w:p>
-    <w:p>
-      <w:pPr>
-        <w:pStyle w:val="Normal"/>
-        <w:spacing w:lineRule="auto" w:line="240" w:before="0" w:after="0"/>
-        <w:contextualSpacing/>
-        <w:jc w:val="both"/>
-        <w:rPr>
-          <w:rFonts w:ascii="Arial Narrow" w:hAnsi="Arial Narrow" w:eastAsia="Times New Roman" w:cs="Arial"/>
-          <w:color w:val="000000"/>
-          <w:kern w:val="0"/>
-          <w:lang w:eastAsia="pt-BR"/>
-          <w14:ligatures w14:val="none"/>
-        </w:rPr>
-      </w:pPr>
-      <w:r>
-        <w:rPr>
-          <w:rFonts w:eastAsia="Times New Roman" w:cs="Arial" w:ascii="Arial Narrow" w:hAnsi="Arial Narrow"/>
-          <w:color w:val="000000"/>
-          <w:kern w:val="0"/>
-          <w:lang w:eastAsia="pt-BR"/>
-          <w14:ligatures w14:val="none"/>
-        </w:rPr>
-      </w:r>
-    </w:p>
-    <w:p>
-      <w:pPr>
-        <w:pStyle w:val="Normal"/>
-        <w:spacing w:lineRule="auto" w:line="240" w:before="0" w:after="0"/>
-        <w:contextualSpacing/>
-        <w:jc w:val="both"/>
-        <w:rPr>
-          <w:rFonts w:ascii="Arial Narrow" w:hAnsi="Arial Narrow" w:eastAsia="Times New Roman" w:cs="Arial"/>
-          <w:color w:val="000000"/>
-          <w:kern w:val="0"/>
-          <w:lang w:eastAsia="pt-BR"/>
-          <w14:ligatures w14:val="none"/>
-        </w:rPr>
-      </w:pPr>
-      <w:r>
-        <w:rPr>
-          <w:rFonts w:eastAsia="Times New Roman" w:cs="Arial" w:ascii="Arial Narrow" w:hAnsi="Arial Narrow"/>
-          <w:color w:val="000000"/>
-          <w:kern w:val="0"/>
-          <w:lang w:eastAsia="pt-BR"/>
-          <w14:ligatures w14:val="none"/>
-        </w:rPr>
-      </w:r>
-    </w:p>
-    <w:p>
-      <w:pPr>
-        <w:pStyle w:val="Normal"/>
-        <w:spacing w:lineRule="auto" w:line="240" w:before="0" w:after="0"/>
-        <w:contextualSpacing/>
-        <w:jc w:val="both"/>
-        <w:rPr>
-          <w:rFonts w:ascii="Arial Narrow" w:hAnsi="Arial Narrow" w:eastAsia="Times New Roman" w:cs="Arial"/>
-          <w:color w:val="000000"/>
-          <w:kern w:val="0"/>
-          <w:lang w:eastAsia="pt-BR"/>
-          <w14:ligatures w14:val="none"/>
-        </w:rPr>
-      </w:pPr>
-      <w:r>
-        <w:rPr>
-          <w:rFonts w:eastAsia="Times New Roman" w:cs="Arial" w:ascii="Arial Narrow" w:hAnsi="Arial Narrow"/>
-          <w:color w:val="000000"/>
-          <w:kern w:val="0"/>
-          <w:lang w:eastAsia="pt-BR"/>
-          <w14:ligatures w14:val="none"/>
-        </w:rPr>
-      </w:r>
-    </w:p>
-    <w:p>
-      <w:pPr>
-        <w:pStyle w:val="Normal"/>
-        <w:spacing w:lineRule="auto" w:line="240" w:before="0" w:after="0"/>
-        <w:contextualSpacing/>
-        <w:jc w:val="both"/>
-        <w:rPr>
-          <w:rFonts w:ascii="Arial Narrow" w:hAnsi="Arial Narrow" w:eastAsia="Times New Roman" w:cs="Arial"/>
-          <w:color w:val="000000"/>
-          <w:kern w:val="0"/>
-          <w:lang w:eastAsia="pt-BR"/>
-          <w14:ligatures w14:val="none"/>
-        </w:rPr>
-      </w:pPr>
-      <w:r>
-        <w:rPr>
-          <w:rFonts w:eastAsia="Times New Roman" w:cs="Arial" w:ascii="Arial Narrow" w:hAnsi="Arial Narrow"/>
-          <w:color w:val="000000"/>
-          <w:kern w:val="0"/>
-          <w:lang w:eastAsia="pt-BR"/>
-          <w14:ligatures w14:val="none"/>
-        </w:rPr>
-      </w:r>
-    </w:p>
-    <w:p>
-      <w:pPr>
-        <w:pStyle w:val="Normal"/>
-        <w:spacing w:lineRule="auto" w:line="240" w:before="0" w:after="0"/>
-        <w:contextualSpacing/>
-        <w:jc w:val="both"/>
-        <w:rPr>
-          <w:rFonts w:ascii="Arial Narrow" w:hAnsi="Arial Narrow" w:eastAsia="Times New Roman" w:cs="Arial"/>
-          <w:color w:val="000000"/>
-          <w:kern w:val="0"/>
-          <w:lang w:eastAsia="pt-BR"/>
-          <w14:ligatures w14:val="none"/>
-        </w:rPr>
-      </w:pPr>
-      <w:r>
-        <w:rPr>
-          <w:rFonts w:eastAsia="Times New Roman" w:cs="Arial" w:ascii="Arial Narrow" w:hAnsi="Arial Narrow"/>
-          <w:color w:val="000000"/>
-          <w:kern w:val="0"/>
-          <w:lang w:eastAsia="pt-BR"/>
-          <w14:ligatures w14:val="none"/>
-        </w:rPr>
-      </w:r>
-    </w:p>
-    <w:p>
-      <w:pPr>
-        <w:pStyle w:val="Normal"/>
-        <w:spacing w:lineRule="auto" w:line="240" w:before="0" w:after="0"/>
-        <w:contextualSpacing/>
-        <w:jc w:val="both"/>
-        <w:rPr>
-          <w:rFonts w:ascii="Arial Narrow" w:hAnsi="Arial Narrow" w:eastAsia="Times New Roman" w:cs="Arial"/>
-          <w:color w:val="000000"/>
-          <w:kern w:val="0"/>
-          <w:lang w:eastAsia="pt-BR"/>
-          <w14:ligatures w14:val="none"/>
-        </w:rPr>
-      </w:pPr>
-      <w:r>
-        <w:rPr>
-          <w:rFonts w:eastAsia="Times New Roman" w:cs="Arial" w:ascii="Arial Narrow" w:hAnsi="Arial Narrow"/>
-          <w:color w:val="000000"/>
-          <w:kern w:val="0"/>
-          <w:lang w:eastAsia="pt-BR"/>
-          <w14:ligatures w14:val="none"/>
-        </w:rPr>
-      </w:r>
-    </w:p>
-    <w:p>
-      <w:pPr>
-        <w:pStyle w:val="Normal"/>
-        <w:spacing w:lineRule="auto" w:line="240" w:before="0" w:after="0"/>
-        <w:contextualSpacing/>
-        <w:jc w:val="both"/>
-        <w:rPr>
-          <w:rFonts w:ascii="Arial Narrow" w:hAnsi="Arial Narrow" w:eastAsia="Times New Roman" w:cs="Arial"/>
-          <w:color w:val="000000"/>
-          <w:kern w:val="0"/>
-          <w:lang w:eastAsia="pt-BR"/>
-          <w14:ligatures w14:val="none"/>
-        </w:rPr>
-      </w:pPr>
-      <w:r>
-        <w:rPr>
-          <w:rFonts w:eastAsia="Times New Roman" w:cs="Arial" w:ascii="Arial Narrow" w:hAnsi="Arial Narrow"/>
-          <w:color w:val="000000"/>
-          <w:kern w:val="0"/>
-          <w:lang w:eastAsia="pt-BR"/>
-          <w14:ligatures w14:val="none"/>
-        </w:rPr>
-      </w:r>
-    </w:p>
-    <w:p>
-      <w:pPr>
-        <w:pStyle w:val="Normal"/>
-        <w:spacing w:lineRule="auto" w:line="240" w:before="0" w:after="0"/>
-        <w:contextualSpacing/>
-        <w:jc w:val="both"/>
-        <w:rPr>
-          <w:rFonts w:ascii="Arial Narrow" w:hAnsi="Arial Narrow" w:eastAsia="Times New Roman" w:cs="Arial"/>
-          <w:color w:val="000000"/>
-          <w:kern w:val="0"/>
-          <w:lang w:eastAsia="pt-BR"/>
-          <w14:ligatures w14:val="none"/>
-        </w:rPr>
-      </w:pPr>
-      <w:r>
-        <w:rPr>
-          <w:rFonts w:eastAsia="Times New Roman" w:cs="Arial" w:ascii="Arial Narrow" w:hAnsi="Arial Narrow"/>
-          <w:color w:val="000000"/>
-          <w:kern w:val="0"/>
-          <w:lang w:eastAsia="pt-BR"/>
-          <w14:ligatures w14:val="none"/>
-        </w:rPr>
-      </w:r>
-    </w:p>
-    <w:p>
-      <w:pPr>
-        <w:pStyle w:val="Normal"/>
-        <w:spacing w:lineRule="auto" w:line="240" w:before="0" w:after="0"/>
-        <w:contextualSpacing/>
-        <w:jc w:val="both"/>
-        <w:rPr>
-          <w:rFonts w:ascii="Arial Narrow" w:hAnsi="Arial Narrow" w:eastAsia="Times New Roman" w:cs="Arial"/>
-          <w:color w:val="000000"/>
-          <w:kern w:val="0"/>
-          <w:lang w:eastAsia="pt-BR"/>
-          <w14:ligatures w14:val="none"/>
-        </w:rPr>
-      </w:pPr>
-      <w:r>
-        <w:rPr>
-          <w:rFonts w:eastAsia="Times New Roman" w:cs="Arial" w:ascii="Arial Narrow" w:hAnsi="Arial Narrow"/>
-          <w:color w:val="000000"/>
-          <w:kern w:val="0"/>
-          <w:lang w:eastAsia="pt-BR"/>
-          <w14:ligatures w14:val="none"/>
-        </w:rPr>
-      </w:r>
-    </w:p>
-    <w:p>
-      <w:pPr>
-        <w:pStyle w:val="Normal"/>
-        <w:spacing w:lineRule="auto" w:line="240" w:before="0" w:after="0"/>
-        <w:contextualSpacing/>
-        <w:jc w:val="both"/>
-        <w:rPr>
-          <w:rFonts w:ascii="Arial Narrow" w:hAnsi="Arial Narrow" w:eastAsia="Times New Roman" w:cs="Arial"/>
-          <w:color w:val="000000"/>
-          <w:kern w:val="0"/>
-          <w:lang w:eastAsia="pt-BR"/>
-          <w14:ligatures w14:val="none"/>
-        </w:rPr>
-      </w:pPr>
-      <w:r>
-        <w:rPr>
-          <w:rFonts w:eastAsia="Times New Roman" w:cs="Arial" w:ascii="Arial Narrow" w:hAnsi="Arial Narrow"/>
-          <w:color w:val="000000"/>
-          <w:kern w:val="0"/>
-          <w:lang w:eastAsia="pt-BR"/>
-          <w14:ligatures w14:val="none"/>
-        </w:rPr>
-      </w:r>
-    </w:p>
-    <w:p>
-      <w:pPr>
-        <w:pStyle w:val="Normal"/>
-        <w:spacing w:lineRule="auto" w:line="240" w:before="0" w:after="0"/>
-        <w:contextualSpacing/>
-        <w:jc w:val="both"/>
-        <w:rPr>
-          <w:rFonts w:ascii="Arial Narrow" w:hAnsi="Arial Narrow" w:eastAsia="Times New Roman" w:cs="Arial"/>
-          <w:color w:val="000000"/>
-          <w:kern w:val="0"/>
-          <w:lang w:eastAsia="pt-BR"/>
-          <w14:ligatures w14:val="none"/>
-        </w:rPr>
-      </w:pPr>
-      <w:r>
-        <w:rPr>
-          <w:rFonts w:eastAsia="Times New Roman" w:cs="Arial" w:ascii="Arial Narrow" w:hAnsi="Arial Narrow"/>
-          <w:color w:val="000000"/>
-          <w:kern w:val="0"/>
-          <w:lang w:eastAsia="pt-BR"/>
-          <w14:ligatures w14:val="none"/>
-        </w:rPr>
-      </w:r>
-    </w:p>
-    <w:p>
-      <w:pPr>
-        <w:pStyle w:val="Normal"/>
-        <w:spacing w:lineRule="auto" w:line="240" w:before="0" w:after="0"/>
-        <w:contextualSpacing/>
-        <w:jc w:val="both"/>
-        <w:rPr>
-          <w:rFonts w:ascii="Arial Narrow" w:hAnsi="Arial Narrow" w:eastAsia="Times New Roman" w:cs="Arial"/>
-          <w:color w:val="000000"/>
-          <w:kern w:val="0"/>
-          <w:lang w:eastAsia="pt-BR"/>
-          <w14:ligatures w14:val="none"/>
-        </w:rPr>
-      </w:pPr>
-      <w:r>
-        <w:rPr>
-          <w:rFonts w:eastAsia="Times New Roman" w:cs="Arial" w:ascii="Arial Narrow" w:hAnsi="Arial Narrow"/>
-          <w:color w:val="000000"/>
-          <w:kern w:val="0"/>
-          <w:lang w:eastAsia="pt-BR"/>
-          <w14:ligatures w14:val="none"/>
-        </w:rPr>
-      </w:r>
-    </w:p>
-    <w:p>
-      <w:pPr>
-        <w:pStyle w:val="Normal"/>
-        <w:spacing w:lineRule="auto" w:line="240" w:before="0" w:after="0"/>
-        <w:contextualSpacing/>
-        <w:jc w:val="both"/>
-        <w:rPr>
-          <w:rFonts w:ascii="Arial Narrow" w:hAnsi="Arial Narrow" w:eastAsia="Times New Roman" w:cs="Arial"/>
-          <w:color w:val="000000"/>
-          <w:kern w:val="0"/>
-          <w:lang w:eastAsia="pt-BR"/>
-          <w14:ligatures w14:val="none"/>
-        </w:rPr>
-      </w:pPr>
-      <w:r>
-        <w:rPr>
-          <w:rFonts w:eastAsia="Times New Roman" w:cs="Arial" w:ascii="Arial Narrow" w:hAnsi="Arial Narrow"/>
-          <w:color w:val="000000"/>
-          <w:kern w:val="0"/>
-          <w:lang w:eastAsia="pt-BR"/>
-          <w14:ligatures w14:val="none"/>
-        </w:rPr>
-      </w:r>
-    </w:p>
-    <w:p>
-      <w:pPr>
-        <w:pStyle w:val="Normal"/>
-        <w:spacing w:lineRule="auto" w:line="240" w:before="0" w:after="0"/>
-        <w:contextualSpacing/>
-        <w:jc w:val="both"/>
-        <w:rPr>
-          <w:rFonts w:ascii="Arial Narrow" w:hAnsi="Arial Narrow" w:eastAsia="Times New Roman" w:cs="Arial"/>
-          <w:color w:val="000000"/>
-          <w:kern w:val="0"/>
-          <w:lang w:eastAsia="pt-BR"/>
-          <w14:ligatures w14:val="none"/>
-        </w:rPr>
-      </w:pPr>
-      <w:r>
-        <w:rPr>
-          <w:rFonts w:eastAsia="Times New Roman" w:cs="Arial" w:ascii="Arial Narrow" w:hAnsi="Arial Narrow"/>
-          <w:color w:val="000000"/>
-          <w:kern w:val="0"/>
-          <w:lang w:eastAsia="pt-BR"/>
-          <w14:ligatures w14:val="none"/>
-        </w:rPr>
-      </w:r>
-    </w:p>
-    <w:p>
-      <w:pPr>
-        <w:pStyle w:val="Normal"/>
-        <w:spacing w:lineRule="auto" w:line="240" w:before="0" w:after="0"/>
-        <w:contextualSpacing/>
-        <w:jc w:val="both"/>
-        <w:rPr>
-          <w:rFonts w:ascii="Arial Narrow" w:hAnsi="Arial Narrow" w:eastAsia="Times New Roman" w:cs="Arial"/>
-          <w:color w:val="000000"/>
-          <w:kern w:val="0"/>
-          <w:lang w:eastAsia="pt-BR"/>
-          <w14:ligatures w14:val="none"/>
-        </w:rPr>
-      </w:pPr>
-      <w:r>
-        <w:rPr>
-          <w:rFonts w:eastAsia="Times New Roman" w:cs="Arial" w:ascii="Arial Narrow" w:hAnsi="Arial Narrow"/>
-          <w:color w:val="000000"/>
-          <w:kern w:val="0"/>
-          <w:lang w:eastAsia="pt-BR"/>
-          <w14:ligatures w14:val="none"/>
-        </w:rPr>
-      </w:r>
-    </w:p>
-    <w:p>
-      <w:pPr>
-        <w:pStyle w:val="Normal"/>
-        <w:spacing w:lineRule="auto" w:line="240" w:before="0" w:after="0"/>
-        <w:contextualSpacing/>
-        <w:jc w:val="both"/>
-        <w:rPr>
-          <w:rFonts w:ascii="Arial Narrow" w:hAnsi="Arial Narrow" w:eastAsia="Times New Roman" w:cs="Arial"/>
-          <w:color w:val="000000"/>
-          <w:kern w:val="0"/>
-          <w:lang w:eastAsia="pt-BR"/>
-          <w14:ligatures w14:val="none"/>
-        </w:rPr>
-      </w:pPr>
-      <w:r>
-        <w:rPr>
-          <w:rFonts w:eastAsia="Times New Roman" w:cs="Arial" w:ascii="Arial Narrow" w:hAnsi="Arial Narrow"/>
-          <w:color w:val="000000"/>
-          <w:kern w:val="0"/>
-          <w:lang w:eastAsia="pt-BR"/>
-          <w14:ligatures w14:val="none"/>
-        </w:rPr>
-      </w:r>
-    </w:p>
-    <w:p>
-      <w:pPr>
-        <w:pStyle w:val="Normal"/>
-        <w:spacing w:lineRule="auto" w:line="240" w:before="0" w:after="0"/>
-        <w:contextualSpacing/>
-        <w:jc w:val="both"/>
-        <w:rPr>
-          <w:rFonts w:ascii="Arial Narrow" w:hAnsi="Arial Narrow" w:eastAsia="Times New Roman" w:cs="Arial"/>
-          <w:color w:val="000000"/>
-          <w:kern w:val="0"/>
-          <w:lang w:eastAsia="pt-BR"/>
-          <w14:ligatures w14:val="none"/>
-        </w:rPr>
-      </w:pPr>
-      <w:r>
-        <w:rPr>
-          <w:rFonts w:eastAsia="Times New Roman" w:cs="Arial" w:ascii="Arial Narrow" w:hAnsi="Arial Narrow"/>
-          <w:color w:val="000000"/>
-          <w:kern w:val="0"/>
-          <w:lang w:eastAsia="pt-BR"/>
-          <w14:ligatures w14:val="none"/>
-        </w:rPr>
-      </w:r>
-    </w:p>
-    <w:p>
-      <w:pPr>
-        <w:pStyle w:val="Normal"/>
-        <w:spacing w:lineRule="auto" w:line="240" w:before="0" w:after="0"/>
-        <w:contextualSpacing/>
-        <w:jc w:val="both"/>
-        <w:rPr>
-          <w:rFonts w:ascii="Arial Narrow" w:hAnsi="Arial Narrow" w:eastAsia="Times New Roman" w:cs="Arial"/>
-          <w:color w:val="000000"/>
-          <w:kern w:val="0"/>
-          <w:lang w:eastAsia="pt-BR"/>
-          <w14:ligatures w14:val="none"/>
-        </w:rPr>
-      </w:pPr>
-      <w:r>
-        <w:rPr/>
       </w:r>
     </w:p>
     <w:p>

</xml_diff>